<commit_message>
Refactor views and styles across multiple pages
- Updated contact.ejs to enhance success and error message displays, adjusted styles for labels and buttons.
- Modified event.ejs to change text color for the 404 page.
- Revamped index.ejs to improve layout and styling for the hero section and added fade-in effects.
- Enhanced reservation.ejs with improved form styling and error handling.
- Updated footer.ejs for better styling and added a gold divider.
- Adjusted header.ejs for consistent text colors and added a gold divider.
- Introduced layout-admin.ejs for admin panel structure and navigation.
- Updated layout.ejs to include improved font loading and structure.
</commit_message>
<xml_diff>
--- a/La Hora.docx
+++ b/La Hora.docx
@@ -58,7 +58,7 @@
     <w:p>
       <w:r>
         <w:pict w14:anchorId="07CE0058">
-          <v:rect id="_x0000_i1025" style="width:0;height:0" o:hralign="center" o:hrstd="t" o:hr="t" fillcolor="#a0a0a0" stroked="f"/>
+          <v:rect id="_x0000_i1026" style="width:0;height:0" o:hralign="center" o:hrstd="t" o:hr="t" fillcolor="#a0a0a0" stroked="f"/>
         </w:pict>
       </w:r>
     </w:p>
@@ -132,7 +132,7 @@
     <w:p>
       <w:r>
         <w:pict w14:anchorId="04EFDFC7">
-          <v:rect id="_x0000_i1026" style="width:0;height:0" o:hralign="center" o:hrstd="t" o:hr="t" fillcolor="#a0a0a0" stroked="f"/>
+          <v:rect id="_x0000_i1027" style="width:0;height:0" o:hralign="center" o:hrstd="t" o:hr="t" fillcolor="#a0a0a0" stroked="f"/>
         </w:pict>
       </w:r>
     </w:p>
@@ -195,7 +195,7 @@
     <w:p>
       <w:r>
         <w:pict w14:anchorId="0168846D">
-          <v:rect id="_x0000_i1027" style="width:0;height:0" o:hralign="center" o:hrstd="t" o:hr="t" fillcolor="#a0a0a0" stroked="f"/>
+          <v:rect id="_x0000_i1028" style="width:0;height:0" o:hralign="center" o:hrstd="t" o:hr="t" fillcolor="#a0a0a0" stroked="f"/>
         </w:pict>
       </w:r>
     </w:p>
@@ -366,7 +366,7 @@
     <w:p>
       <w:r>
         <w:pict w14:anchorId="21AD06BE">
-          <v:rect id="_x0000_i1028" style="width:0;height:0" o:hralign="center" o:hrstd="t" o:hr="t" fillcolor="#a0a0a0" stroked="f"/>
+          <v:rect id="_x0000_i1029" style="width:0;height:0" o:hralign="center" o:hrstd="t" o:hr="t" fillcolor="#a0a0a0" stroked="f"/>
         </w:pict>
       </w:r>
     </w:p>
@@ -437,7 +437,7 @@
     <w:p>
       <w:r>
         <w:pict w14:anchorId="05E862E5">
-          <v:rect id="_x0000_i1029" style="width:0;height:0" o:hralign="center" o:hrstd="t" o:hr="t" fillcolor="#a0a0a0" stroked="f"/>
+          <v:rect id="_x0000_i1030" style="width:0;height:0" o:hralign="center" o:hrstd="t" o:hr="t" fillcolor="#a0a0a0" stroked="f"/>
         </w:pict>
       </w:r>
     </w:p>
@@ -501,7 +501,7 @@
     <w:p>
       <w:r>
         <w:pict w14:anchorId="3F26AF30">
-          <v:rect id="_x0000_i1030" style="width:0;height:0" o:hralign="center" o:hrstd="t" o:hr="t" fillcolor="#a0a0a0" stroked="f"/>
+          <v:rect id="_x0000_i1031" style="width:0;height:0" o:hralign="center" o:hrstd="t" o:hr="t" fillcolor="#a0a0a0" stroked="f"/>
         </w:pict>
       </w:r>
     </w:p>
@@ -591,7 +591,7 @@
     <w:p>
       <w:r>
         <w:pict w14:anchorId="4A1BAB47">
-          <v:rect id="_x0000_i1031" style="width:0;height:0" o:hralign="center" o:hrstd="t" o:hr="t" fillcolor="#a0a0a0" stroked="f"/>
+          <v:rect id="_x0000_i1032" style="width:0;height:0" o:hralign="center" o:hrstd="t" o:hr="t" fillcolor="#a0a0a0" stroked="f"/>
         </w:pict>
       </w:r>
     </w:p>
@@ -654,7 +654,7 @@
     <w:p>
       <w:r>
         <w:pict w14:anchorId="22869511">
-          <v:rect id="_x0000_i1032" style="width:0;height:0" o:hralign="center" o:hrstd="t" o:hr="t" fillcolor="#a0a0a0" stroked="f"/>
+          <v:rect id="_x0000_i1033" style="width:0;height:0" o:hralign="center" o:hrstd="t" o:hr="t" fillcolor="#a0a0a0" stroked="f"/>
         </w:pict>
       </w:r>
     </w:p>
@@ -727,7 +727,7 @@
     <w:p>
       <w:r>
         <w:pict w14:anchorId="20117196">
-          <v:rect id="_x0000_i1033" style="width:0;height:0" o:hralign="center" o:hrstd="t" o:hr="t" fillcolor="#a0a0a0" stroked="f"/>
+          <v:rect id="_x0000_i1034" style="width:0;height:0" o:hralign="center" o:hrstd="t" o:hr="t" fillcolor="#a0a0a0" stroked="f"/>
         </w:pict>
       </w:r>
     </w:p>
@@ -790,7 +790,7 @@
     <w:p>
       <w:r>
         <w:pict w14:anchorId="583F5B1C">
-          <v:rect id="_x0000_i1034" style="width:0;height:0" o:hralign="center" o:hrstd="t" o:hr="t" fillcolor="#a0a0a0" stroked="f"/>
+          <v:rect id="_x0000_i1035" style="width:0;height:0" o:hralign="center" o:hrstd="t" o:hr="t" fillcolor="#a0a0a0" stroked="f"/>
         </w:pict>
       </w:r>
     </w:p>
@@ -816,7 +816,7 @@
     <w:p>
       <w:r>
         <w:pict w14:anchorId="44D5681E">
-          <v:rect id="_x0000_i1035" style="width:0;height:0" o:hralign="center" o:hrstd="t" o:hr="t" fillcolor="#a0a0a0" stroked="f"/>
+          <v:rect id="_x0000_i1036" style="width:0;height:0" o:hralign="center" o:hrstd="t" o:hr="t" fillcolor="#a0a0a0" stroked="f"/>
         </w:pict>
       </w:r>
     </w:p>
@@ -929,7 +929,7 @@
     <w:p>
       <w:r>
         <w:pict w14:anchorId="4A081F2A">
-          <v:rect id="_x0000_i1036" style="width:0;height:0" o:hralign="center" o:hrstd="t" o:hr="t" fillcolor="#a0a0a0" stroked="f"/>
+          <v:rect id="_x0000_i1037" style="width:0;height:0" o:hralign="center" o:hrstd="t" o:hr="t" fillcolor="#a0a0a0" stroked="f"/>
         </w:pict>
       </w:r>
     </w:p>
@@ -1018,7 +1018,7 @@
     <w:p>
       <w:r>
         <w:pict w14:anchorId="34A0670D">
-          <v:rect id="_x0000_i1037" style="width:0;height:0" o:hralign="center" o:hrstd="t" o:hr="t" fillcolor="#a0a0a0" stroked="f"/>
+          <v:rect id="_x0000_i1038" style="width:0;height:0" o:hralign="center" o:hrstd="t" o:hr="t" fillcolor="#a0a0a0" stroked="f"/>
         </w:pict>
       </w:r>
     </w:p>
@@ -1048,7 +1048,7 @@
     <w:p>
       <w:r>
         <w:pict w14:anchorId="023460DB">
-          <v:rect id="_x0000_i1099" style="width:0;height:0" o:hralign="center" o:hrstd="t" o:hr="t" fillcolor="#a0a0a0" stroked="f"/>
+          <v:rect id="_x0000_i1039" style="width:0;height:0" o:hralign="center" o:hrstd="t" o:hr="t" fillcolor="#a0a0a0" stroked="f"/>
         </w:pict>
       </w:r>
     </w:p>
@@ -3458,7 +3458,7 @@
     <w:p>
       <w:r>
         <w:pict w14:anchorId="4EF94CAB">
-          <v:rect id="_x0000_i1045" style="width:0;height:0" o:hralign="center" o:hrstd="t" o:hr="t" fillcolor="#a0a0a0" stroked="f"/>
+          <v:rect id="_x0000_i1040" style="width:0;height:0" o:hralign="center" o:hrstd="t" o:hr="t" fillcolor="#a0a0a0" stroked="f"/>
         </w:pict>
       </w:r>
     </w:p>
@@ -3596,7 +3596,7 @@
     <w:p>
       <w:r>
         <w:pict w14:anchorId="4CFF1AC1">
-          <v:rect id="_x0000_i1046" style="width:0;height:0" o:hralign="center" o:hrstd="t" o:hr="t" fillcolor="#a0a0a0" stroked="f"/>
+          <v:rect id="_x0000_i1041" style="width:0;height:0" o:hralign="center" o:hrstd="t" o:hr="t" fillcolor="#a0a0a0" stroked="f"/>
         </w:pict>
       </w:r>
     </w:p>
@@ -4053,7 +4053,7 @@
     <w:p>
       <w:r>
         <w:pict w14:anchorId="71B247C2">
-          <v:rect id="_x0000_i1091" style="width:0;height:0" o:hralign="center" o:hrstd="t" o:hr="t" fillcolor="#a0a0a0" stroked="f"/>
+          <v:rect id="_x0000_i1042" style="width:0;height:0" o:hralign="center" o:hrstd="t" o:hr="t" fillcolor="#a0a0a0" stroked="f"/>
         </w:pict>
       </w:r>
     </w:p>
@@ -4298,7 +4298,15 @@
         <w:t>Hébergement</w:t>
       </w:r>
       <w:r>
-        <w:t xml:space="preserve"> : Render, Railway, </w:t>
+        <w:t xml:space="preserve"> : </w:t>
+      </w:r>
+      <w:proofErr w:type="spellStart"/>
+      <w:r>
+        <w:t>Render</w:t>
+      </w:r>
+      <w:proofErr w:type="spellEnd"/>
+      <w:r>
+        <w:t xml:space="preserve">, Railway, </w:t>
       </w:r>
       <w:proofErr w:type="spellStart"/>
       <w:r>
@@ -4828,7 +4836,7 @@
       </w:r>
       <w:r>
         <w:pict w14:anchorId="1063EE06">
-          <v:rect id="_x0000_i1050" style="width:0;height:0" o:hralign="center" o:hrstd="t" o:hr="t" fillcolor="#a0a0a0" stroked="f"/>
+          <v:rect id="_x0000_i1043" style="width:0;height:0" o:hralign="center" o:hrstd="t" o:hr="t" fillcolor="#a0a0a0" stroked="f"/>
         </w:pict>
       </w:r>
     </w:p>
@@ -4934,7 +4942,7 @@
     <w:p>
       <w:r>
         <w:pict w14:anchorId="64AF15A6">
-          <v:rect id="_x0000_i1051" style="width:0;height:0" o:hralign="center" o:hrstd="t" o:hr="t" fillcolor="#a0a0a0" stroked="f"/>
+          <v:rect id="_x0000_i1044" style="width:0;height:0" o:hralign="center" o:hrstd="t" o:hr="t" fillcolor="#a0a0a0" stroked="f"/>
         </w:pict>
       </w:r>
     </w:p>
@@ -4983,7 +4991,7 @@
     <w:p>
       <w:r>
         <w:pict w14:anchorId="43162D28">
-          <v:rect id="_x0000_i1101" style="width:0;height:0" o:hralign="center" o:hrstd="t" o:hr="t" fillcolor="#a0a0a0" stroked="f"/>
+          <v:rect id="_x0000_i1045" style="width:0;height:0" o:hralign="center" o:hrstd="t" o:hr="t" fillcolor="#a0a0a0" stroked="f"/>
         </w:pict>
       </w:r>
     </w:p>
@@ -5015,7 +5023,7 @@
     <w:p>
       <w:r>
         <w:pict w14:anchorId="2BDE675C">
-          <v:rect id="_x0000_i1052" style="width:0;height:0" o:hralign="center" o:hrstd="t" o:hr="t" fillcolor="#a0a0a0" stroked="f"/>
+          <v:rect id="_x0000_i1046" style="width:0;height:0" o:hralign="center" o:hrstd="t" o:hr="t" fillcolor="#a0a0a0" stroked="f"/>
         </w:pict>
       </w:r>
     </w:p>
@@ -5110,7 +5118,7 @@
     <w:p>
       <w:r>
         <w:pict w14:anchorId="0E2FF709">
-          <v:rect id="_x0000_i1053" style="width:0;height:0" o:hralign="center" o:hrstd="t" o:hr="t" fillcolor="#a0a0a0" stroked="f"/>
+          <v:rect id="_x0000_i1047" style="width:0;height:0" o:hralign="center" o:hrstd="t" o:hr="t" fillcolor="#a0a0a0" stroked="f"/>
         </w:pict>
       </w:r>
     </w:p>
@@ -5188,7 +5196,7 @@
       </w:r>
       <w:r>
         <w:pict w14:anchorId="6124DA1A">
-          <v:rect id="_x0000_i1054" style="width:0;height:0" o:hralign="center" o:hrstd="t" o:hr="t" fillcolor="#a0a0a0" stroked="f"/>
+          <v:rect id="_x0000_i1048" style="width:0;height:0" o:hralign="center" o:hrstd="t" o:hr="t" fillcolor="#a0a0a0" stroked="f"/>
         </w:pict>
       </w:r>
     </w:p>
@@ -8327,7 +8335,7 @@
     <w:p>
       <w:r>
         <w:pict w14:anchorId="5DCFFC5F">
-          <v:rect id="_x0000_i1055" style="width:0;height:0" o:hralign="center" o:hrstd="t" o:hr="t" fillcolor="#a0a0a0" stroked="f"/>
+          <v:rect id="_x0000_i1049" style="width:0;height:0" o:hralign="center" o:hrstd="t" o:hr="t" fillcolor="#a0a0a0" stroked="f"/>
         </w:pict>
       </w:r>
     </w:p>
@@ -8442,7 +8450,7 @@
     <w:p>
       <w:r>
         <w:pict w14:anchorId="0F11BC0E">
-          <v:rect id="_x0000_i1056" style="width:0;height:0" o:hralign="center" o:hrstd="t" o:hr="t" fillcolor="#a0a0a0" stroked="f"/>
+          <v:rect id="_x0000_i1050" style="width:0;height:0" o:hralign="center" o:hrstd="t" o:hr="t" fillcolor="#a0a0a0" stroked="f"/>
         </w:pict>
       </w:r>
     </w:p>
@@ -8463,7 +8471,7 @@
     <w:p>
       <w:r>
         <w:pict w14:anchorId="39E8B771">
-          <v:rect id="_x0000_i1103" style="width:0;height:0" o:hralign="center" o:hrstd="t" o:hr="t" fillcolor="#a0a0a0" stroked="f"/>
+          <v:rect id="_x0000_i1051" style="width:0;height:0" o:hralign="center" o:hrstd="t" o:hr="t" fillcolor="#a0a0a0" stroked="f"/>
         </w:pict>
       </w:r>
     </w:p>
@@ -8485,7 +8493,7 @@
     <w:p>
       <w:r>
         <w:pict w14:anchorId="36681C02">
-          <v:rect id="_x0000_i1057" style="width:0;height:0" o:hralign="center" o:hrstd="t" o:hr="t" fillcolor="#a0a0a0" stroked="f"/>
+          <v:rect id="_x0000_i1052" style="width:0;height:0" o:hralign="center" o:hrstd="t" o:hr="t" fillcolor="#a0a0a0" stroked="f"/>
         </w:pict>
       </w:r>
     </w:p>
@@ -8859,7 +8867,7 @@
     <w:p>
       <w:r>
         <w:pict w14:anchorId="5BC92CE8">
-          <v:rect id="_x0000_i1059" style="width:0;height:0" o:hralign="center" o:hrstd="t" o:hr="t" fillcolor="#a0a0a0" stroked="f"/>
+          <v:rect id="_x0000_i1053" style="width:0;height:0" o:hralign="center" o:hrstd="t" o:hr="t" fillcolor="#a0a0a0" stroked="f"/>
         </w:pict>
       </w:r>
     </w:p>
@@ -8952,7 +8960,7 @@
     <w:p>
       <w:r>
         <w:pict w14:anchorId="6FD398B4">
-          <v:rect id="_x0000_i1081" style="width:0;height:0" o:hralign="center" o:hrstd="t" o:hr="t" fillcolor="#a0a0a0" stroked="f"/>
+          <v:rect id="_x0000_i1054" style="width:0;height:0" o:hralign="center" o:hrstd="t" o:hr="t" fillcolor="#a0a0a0" stroked="f"/>
         </w:pict>
       </w:r>
     </w:p>
@@ -10007,7 +10015,7 @@
       </w:r>
       <w:r>
         <w:pict w14:anchorId="37D1F052">
-          <v:rect id="_x0000_i1083" style="width:0;height:1.5pt" o:hralign="center" o:hrstd="t" o:hr="t" fillcolor="#a0a0a0" stroked="f"/>
+          <v:rect id="_x0000_i1055" style="width:0;height:1.5pt" o:hralign="center" o:hrstd="t" o:hr="t" fillcolor="#a0a0a0" stroked="f"/>
         </w:pict>
       </w:r>
     </w:p>
@@ -10432,14 +10440,1980 @@
       <w:pPr>
         <w:ind w:firstLine="708"/>
       </w:pPr>
-      <w:r>
-        <w:t>Mongoose  + COMPA</w:t>
+      <w:proofErr w:type="gramStart"/>
+      <w:r>
+        <w:t>Mongoose  +</w:t>
+      </w:r>
+      <w:proofErr w:type="gramEnd"/>
+      <w:r>
+        <w:t xml:space="preserve"> COMPA</w:t>
       </w:r>
       <w:r>
         <w:tab/>
         <w:t>SS</w:t>
       </w:r>
     </w:p>
+    <w:p>
+      <w:pPr>
+        <w:ind w:firstLine="708"/>
+      </w:pPr>
+    </w:p>
+    <w:p>
+      <w:pPr>
+        <w:ind w:firstLine="708"/>
+      </w:pPr>
+    </w:p>
+    <w:p>
+      <w:pPr>
+        <w:rPr>
+          <w:rFonts w:asciiTheme="majorHAnsi" w:eastAsiaTheme="majorEastAsia" w:hAnsiTheme="majorHAnsi" w:cstheme="majorBidi"/>
+          <w:color w:val="0F4761" w:themeColor="accent1" w:themeShade="BF"/>
+          <w:sz w:val="40"/>
+          <w:szCs w:val="40"/>
+        </w:rPr>
+      </w:pPr>
+      <w:r>
+        <w:br w:type="page"/>
+      </w:r>
+    </w:p>
+    <w:p>
+      <w:pPr>
+        <w:pStyle w:val="Titre1"/>
+      </w:pPr>
+      <w:r>
+        <w:lastRenderedPageBreak/>
+        <w:br w:type="page"/>
+      </w:r>
+      <w:r>
+        <w:lastRenderedPageBreak/>
+        <w:t>La Hora V2</w:t>
+      </w:r>
+    </w:p>
+    <w:p/>
+    <w:p>
+      <w:pPr>
+        <w:pStyle w:val="Titre2"/>
+      </w:pPr>
+      <w:r>
+        <w:t>1) Architecture (monorepo Express + EJS)</w:t>
+      </w:r>
+    </w:p>
+    <w:p>
+      <w:r>
+        <w:rPr>
+          <w:noProof/>
+        </w:rPr>
+        <w:drawing>
+          <wp:inline distT="0" distB="0" distL="0" distR="0" wp14:anchorId="53D7EFFE" wp14:editId="071327E3">
+            <wp:extent cx="5760720" cy="4242435"/>
+            <wp:effectExtent l="0" t="0" r="0" b="5715"/>
+            <wp:docPr id="970098116" name="Image 1" descr="Une image contenant texte, capture d’écran, Police, menu&#10;&#10;Le contenu généré par l’IA peut être incorrect."/>
+            <wp:cNvGraphicFramePr>
+              <a:graphicFrameLocks xmlns:a="http://schemas.openxmlformats.org/drawingml/2006/main" noChangeAspect="1"/>
+            </wp:cNvGraphicFramePr>
+            <a:graphic xmlns:a="http://schemas.openxmlformats.org/drawingml/2006/main">
+              <a:graphicData uri="http://schemas.openxmlformats.org/drawingml/2006/picture">
+                <pic:pic xmlns:pic="http://schemas.openxmlformats.org/drawingml/2006/picture">
+                  <pic:nvPicPr>
+                    <pic:cNvPr id="970098116" name="Image 1" descr="Une image contenant texte, capture d’écran, Police, menu&#10;&#10;Le contenu généré par l’IA peut être incorrect."/>
+                    <pic:cNvPicPr/>
+                  </pic:nvPicPr>
+                  <pic:blipFill>
+                    <a:blip r:embed="rId16"/>
+                    <a:stretch>
+                      <a:fillRect/>
+                    </a:stretch>
+                  </pic:blipFill>
+                  <pic:spPr>
+                    <a:xfrm>
+                      <a:off x="0" y="0"/>
+                      <a:ext cx="5760720" cy="4242435"/>
+                    </a:xfrm>
+                    <a:prstGeom prst="rect">
+                      <a:avLst/>
+                    </a:prstGeom>
+                  </pic:spPr>
+                </pic:pic>
+              </a:graphicData>
+            </a:graphic>
+          </wp:inline>
+        </w:drawing>
+      </w:r>
+    </w:p>
+    <w:p/>
+    <w:p>
+      <w:pPr>
+        <w:pStyle w:val="Titre2"/>
+      </w:pPr>
+      <w:r>
+        <w:lastRenderedPageBreak/>
+        <w:t>2) Modèles Mongoose (RBAC prêt)</w:t>
+      </w:r>
+    </w:p>
+    <w:p>
+      <w:pPr>
+        <w:pStyle w:val="Titre3"/>
+      </w:pPr>
+      <w:r>
+        <w:t>User (compte d’accès + rôles)</w:t>
+      </w:r>
+    </w:p>
+    <w:p>
+      <w:r>
+        <w:rPr>
+          <w:noProof/>
+        </w:rPr>
+        <w:drawing>
+          <wp:inline distT="0" distB="0" distL="0" distR="0" wp14:anchorId="480CF848" wp14:editId="1E35711D">
+            <wp:extent cx="5760720" cy="3084830"/>
+            <wp:effectExtent l="0" t="0" r="0" b="1270"/>
+            <wp:docPr id="294885940" name="Image 1" descr="Une image contenant texte, capture d’écran, logiciel&#10;&#10;Le contenu généré par l’IA peut être incorrect."/>
+            <wp:cNvGraphicFramePr>
+              <a:graphicFrameLocks xmlns:a="http://schemas.openxmlformats.org/drawingml/2006/main" noChangeAspect="1"/>
+            </wp:cNvGraphicFramePr>
+            <a:graphic xmlns:a="http://schemas.openxmlformats.org/drawingml/2006/main">
+              <a:graphicData uri="http://schemas.openxmlformats.org/drawingml/2006/picture">
+                <pic:pic xmlns:pic="http://schemas.openxmlformats.org/drawingml/2006/picture">
+                  <pic:nvPicPr>
+                    <pic:cNvPr id="294885940" name="Image 1" descr="Une image contenant texte, capture d’écran, logiciel&#10;&#10;Le contenu généré par l’IA peut être incorrect."/>
+                    <pic:cNvPicPr/>
+                  </pic:nvPicPr>
+                  <pic:blipFill>
+                    <a:blip r:embed="rId17"/>
+                    <a:stretch>
+                      <a:fillRect/>
+                    </a:stretch>
+                  </pic:blipFill>
+                  <pic:spPr>
+                    <a:xfrm>
+                      <a:off x="0" y="0"/>
+                      <a:ext cx="5760720" cy="3084830"/>
+                    </a:xfrm>
+                    <a:prstGeom prst="rect">
+                      <a:avLst/>
+                    </a:prstGeom>
+                  </pic:spPr>
+                </pic:pic>
+              </a:graphicData>
+            </a:graphic>
+          </wp:inline>
+        </w:drawing>
+      </w:r>
+    </w:p>
+    <w:p/>
+    <w:p>
+      <w:pPr>
+        <w:pStyle w:val="Titre3"/>
+      </w:pPr>
+      <w:r>
+        <w:t>Customer (fiche client liée)</w:t>
+      </w:r>
+    </w:p>
+    <w:p>
+      <w:r>
+        <w:rPr>
+          <w:noProof/>
+        </w:rPr>
+        <w:drawing>
+          <wp:inline distT="0" distB="0" distL="0" distR="0" wp14:anchorId="40355995" wp14:editId="66EB10BF">
+            <wp:extent cx="5760720" cy="2291080"/>
+            <wp:effectExtent l="0" t="0" r="0" b="0"/>
+            <wp:docPr id="1280856132" name="Image 1" descr="Une image contenant texte, capture d’écran, logiciel&#10;&#10;Le contenu généré par l’IA peut être incorrect."/>
+            <wp:cNvGraphicFramePr>
+              <a:graphicFrameLocks xmlns:a="http://schemas.openxmlformats.org/drawingml/2006/main" noChangeAspect="1"/>
+            </wp:cNvGraphicFramePr>
+            <a:graphic xmlns:a="http://schemas.openxmlformats.org/drawingml/2006/main">
+              <a:graphicData uri="http://schemas.openxmlformats.org/drawingml/2006/picture">
+                <pic:pic xmlns:pic="http://schemas.openxmlformats.org/drawingml/2006/picture">
+                  <pic:nvPicPr>
+                    <pic:cNvPr id="1280856132" name="Image 1" descr="Une image contenant texte, capture d’écran, logiciel&#10;&#10;Le contenu généré par l’IA peut être incorrect."/>
+                    <pic:cNvPicPr/>
+                  </pic:nvPicPr>
+                  <pic:blipFill>
+                    <a:blip r:embed="rId18"/>
+                    <a:stretch>
+                      <a:fillRect/>
+                    </a:stretch>
+                  </pic:blipFill>
+                  <pic:spPr>
+                    <a:xfrm>
+                      <a:off x="0" y="0"/>
+                      <a:ext cx="5760720" cy="2291080"/>
+                    </a:xfrm>
+                    <a:prstGeom prst="rect">
+                      <a:avLst/>
+                    </a:prstGeom>
+                  </pic:spPr>
+                </pic:pic>
+              </a:graphicData>
+            </a:graphic>
+          </wp:inline>
+        </w:drawing>
+      </w:r>
+    </w:p>
+    <w:p/>
+    <w:p>
+      <w:pPr>
+        <w:pStyle w:val="Titre3"/>
+      </w:pPr>
+      <w:r>
+        <w:lastRenderedPageBreak/>
+        <w:t>Employee (fiche employé + rôle métier)</w:t>
+      </w:r>
+    </w:p>
+    <w:p>
+      <w:r>
+        <w:rPr>
+          <w:noProof/>
+        </w:rPr>
+        <w:drawing>
+          <wp:inline distT="0" distB="0" distL="0" distR="0" wp14:anchorId="47D9D903" wp14:editId="53FAAA67">
+            <wp:extent cx="5760720" cy="1829435"/>
+            <wp:effectExtent l="0" t="0" r="0" b="0"/>
+            <wp:docPr id="1957533879" name="Image 1" descr="Une image contenant texte, capture d’écran, Police&#10;&#10;Le contenu généré par l’IA peut être incorrect."/>
+            <wp:cNvGraphicFramePr>
+              <a:graphicFrameLocks xmlns:a="http://schemas.openxmlformats.org/drawingml/2006/main" noChangeAspect="1"/>
+            </wp:cNvGraphicFramePr>
+            <a:graphic xmlns:a="http://schemas.openxmlformats.org/drawingml/2006/main">
+              <a:graphicData uri="http://schemas.openxmlformats.org/drawingml/2006/picture">
+                <pic:pic xmlns:pic="http://schemas.openxmlformats.org/drawingml/2006/picture">
+                  <pic:nvPicPr>
+                    <pic:cNvPr id="1957533879" name="Image 1" descr="Une image contenant texte, capture d’écran, Police&#10;&#10;Le contenu généré par l’IA peut être incorrect."/>
+                    <pic:cNvPicPr/>
+                  </pic:nvPicPr>
+                  <pic:blipFill>
+                    <a:blip r:embed="rId19"/>
+                    <a:stretch>
+                      <a:fillRect/>
+                    </a:stretch>
+                  </pic:blipFill>
+                  <pic:spPr>
+                    <a:xfrm>
+                      <a:off x="0" y="0"/>
+                      <a:ext cx="5760720" cy="1829435"/>
+                    </a:xfrm>
+                    <a:prstGeom prst="rect">
+                      <a:avLst/>
+                    </a:prstGeom>
+                  </pic:spPr>
+                </pic:pic>
+              </a:graphicData>
+            </a:graphic>
+          </wp:inline>
+        </w:drawing>
+      </w:r>
+    </w:p>
+    <w:p/>
+    <w:p>
+      <w:pPr>
+        <w:pStyle w:val="Titre3"/>
+      </w:pPr>
+      <w:r>
+        <w:t>MenuItem (carte, images Cloudinary)</w:t>
+      </w:r>
+    </w:p>
+    <w:p>
+      <w:pPr>
+        <w:jc w:val="center"/>
+      </w:pPr>
+      <w:r>
+        <w:rPr>
+          <w:noProof/>
+        </w:rPr>
+        <w:drawing>
+          <wp:inline distT="0" distB="0" distL="0" distR="0" wp14:anchorId="7DE9B877" wp14:editId="0A2C5DE3">
+            <wp:extent cx="4893945" cy="2788920"/>
+            <wp:effectExtent l="0" t="0" r="1905" b="0"/>
+            <wp:docPr id="416083468" name="Image 1" descr="Une image contenant texte, capture d’écran, logiciel&#10;&#10;Le contenu généré par l’IA peut être incorrect."/>
+            <wp:cNvGraphicFramePr>
+              <a:graphicFrameLocks xmlns:a="http://schemas.openxmlformats.org/drawingml/2006/main" noChangeAspect="1"/>
+            </wp:cNvGraphicFramePr>
+            <a:graphic xmlns:a="http://schemas.openxmlformats.org/drawingml/2006/main">
+              <a:graphicData uri="http://schemas.openxmlformats.org/drawingml/2006/picture">
+                <pic:pic xmlns:pic="http://schemas.openxmlformats.org/drawingml/2006/picture">
+                  <pic:nvPicPr>
+                    <pic:cNvPr id="416083468" name="Image 1" descr="Une image contenant texte, capture d’écran, logiciel&#10;&#10;Le contenu généré par l’IA peut être incorrect."/>
+                    <pic:cNvPicPr/>
+                  </pic:nvPicPr>
+                  <pic:blipFill>
+                    <a:blip r:embed="rId20">
+                      <a:extLst>
+                        <a:ext uri="{28A0092B-C50C-407E-A947-70E740481C1C}">
+                          <a14:useLocalDpi xmlns:a14="http://schemas.microsoft.com/office/drawing/2010/main" val="0"/>
+                        </a:ext>
+                      </a:extLst>
+                    </a:blip>
+                    <a:stretch>
+                      <a:fillRect/>
+                    </a:stretch>
+                  </pic:blipFill>
+                  <pic:spPr>
+                    <a:xfrm>
+                      <a:off x="0" y="0"/>
+                      <a:ext cx="4893945" cy="2788920"/>
+                    </a:xfrm>
+                    <a:prstGeom prst="rect">
+                      <a:avLst/>
+                    </a:prstGeom>
+                  </pic:spPr>
+                </pic:pic>
+              </a:graphicData>
+            </a:graphic>
+          </wp:inline>
+        </w:drawing>
+      </w:r>
+    </w:p>
+    <w:p/>
+    <w:p>
+      <w:pPr>
+        <w:pStyle w:val="Titre3"/>
+      </w:pPr>
+      <w:proofErr w:type="spellStart"/>
+      <w:r>
+        <w:t>Reservation</w:t>
+      </w:r>
+      <w:proofErr w:type="spellEnd"/>
+    </w:p>
+    <w:p>
+      <w:pPr>
+        <w:jc w:val="center"/>
+      </w:pPr>
+      <w:r>
+        <w:rPr>
+          <w:noProof/>
+        </w:rPr>
+        <w:drawing>
+          <wp:inline distT="0" distB="0" distL="0" distR="0" wp14:anchorId="19E2B048" wp14:editId="7F14CAC4">
+            <wp:extent cx="4893945" cy="2442656"/>
+            <wp:effectExtent l="0" t="0" r="1905" b="0"/>
+            <wp:docPr id="568636142" name="Image 1" descr="Une image contenant texte, capture d’écran, logiciel&#10;&#10;Le contenu généré par l’IA peut être incorrect."/>
+            <wp:cNvGraphicFramePr>
+              <a:graphicFrameLocks xmlns:a="http://schemas.openxmlformats.org/drawingml/2006/main" noChangeAspect="1"/>
+            </wp:cNvGraphicFramePr>
+            <a:graphic xmlns:a="http://schemas.openxmlformats.org/drawingml/2006/main">
+              <a:graphicData uri="http://schemas.openxmlformats.org/drawingml/2006/picture">
+                <pic:pic xmlns:pic="http://schemas.openxmlformats.org/drawingml/2006/picture">
+                  <pic:nvPicPr>
+                    <pic:cNvPr id="568636142" name="Image 1" descr="Une image contenant texte, capture d’écran, logiciel&#10;&#10;Le contenu généré par l’IA peut être incorrect."/>
+                    <pic:cNvPicPr/>
+                  </pic:nvPicPr>
+                  <pic:blipFill>
+                    <a:blip r:embed="rId21"/>
+                    <a:stretch>
+                      <a:fillRect/>
+                    </a:stretch>
+                  </pic:blipFill>
+                  <pic:spPr>
+                    <a:xfrm>
+                      <a:off x="0" y="0"/>
+                      <a:ext cx="4901101" cy="2446228"/>
+                    </a:xfrm>
+                    <a:prstGeom prst="rect">
+                      <a:avLst/>
+                    </a:prstGeom>
+                  </pic:spPr>
+                </pic:pic>
+              </a:graphicData>
+            </a:graphic>
+          </wp:inline>
+        </w:drawing>
+      </w:r>
+    </w:p>
+    <w:p/>
+    <w:p>
+      <w:pPr>
+        <w:pStyle w:val="Titre2"/>
+      </w:pPr>
+      <w:r>
+        <w:t xml:space="preserve">3) Cloudinary + </w:t>
+      </w:r>
+      <w:proofErr w:type="spellStart"/>
+      <w:r>
+        <w:t>Multer</w:t>
+      </w:r>
+      <w:proofErr w:type="spellEnd"/>
+      <w:r>
+        <w:t xml:space="preserve"> (</w:t>
+      </w:r>
+      <w:proofErr w:type="spellStart"/>
+      <w:r>
+        <w:t>upload</w:t>
+      </w:r>
+      <w:proofErr w:type="spellEnd"/>
+      <w:r>
+        <w:t xml:space="preserve"> simple et propre)</w:t>
+      </w:r>
+    </w:p>
+    <w:p>
+      <w:pPr>
+        <w:pStyle w:val="Titre3"/>
+      </w:pPr>
+      <w:proofErr w:type="gramStart"/>
+      <w:r>
+        <w:t>.</w:t>
+      </w:r>
+      <w:proofErr w:type="spellStart"/>
+      <w:r>
+        <w:t>env</w:t>
+      </w:r>
+      <w:proofErr w:type="gramEnd"/>
+      <w:r>
+        <w:t>.example</w:t>
+      </w:r>
+      <w:proofErr w:type="spellEnd"/>
+    </w:p>
+    <w:p>
+      <w:r>
+        <w:rPr>
+          <w:noProof/>
+        </w:rPr>
+        <w:drawing>
+          <wp:inline distT="0" distB="0" distL="0" distR="0" wp14:anchorId="012305EF" wp14:editId="4FAD805E">
+            <wp:extent cx="5760720" cy="5322570"/>
+            <wp:effectExtent l="0" t="0" r="0" b="0"/>
+            <wp:docPr id="2089867819" name="Image 1" descr="Une image contenant texte, capture d’écran, Police, conception&#10;&#10;Le contenu généré par l’IA peut être incorrect."/>
+            <wp:cNvGraphicFramePr>
+              <a:graphicFrameLocks xmlns:a="http://schemas.openxmlformats.org/drawingml/2006/main" noChangeAspect="1"/>
+            </wp:cNvGraphicFramePr>
+            <a:graphic xmlns:a="http://schemas.openxmlformats.org/drawingml/2006/main">
+              <a:graphicData uri="http://schemas.openxmlformats.org/drawingml/2006/picture">
+                <pic:pic xmlns:pic="http://schemas.openxmlformats.org/drawingml/2006/picture">
+                  <pic:nvPicPr>
+                    <pic:cNvPr id="2089867819" name="Image 1" descr="Une image contenant texte, capture d’écran, Police, conception&#10;&#10;Le contenu généré par l’IA peut être incorrect."/>
+                    <pic:cNvPicPr/>
+                  </pic:nvPicPr>
+                  <pic:blipFill>
+                    <a:blip r:embed="rId22"/>
+                    <a:stretch>
+                      <a:fillRect/>
+                    </a:stretch>
+                  </pic:blipFill>
+                  <pic:spPr>
+                    <a:xfrm>
+                      <a:off x="0" y="0"/>
+                      <a:ext cx="5760720" cy="5322570"/>
+                    </a:xfrm>
+                    <a:prstGeom prst="rect">
+                      <a:avLst/>
+                    </a:prstGeom>
+                  </pic:spPr>
+                </pic:pic>
+              </a:graphicData>
+            </a:graphic>
+          </wp:inline>
+        </w:drawing>
+      </w:r>
+    </w:p>
+    <w:p/>
+    <w:p>
+      <w:pPr>
+        <w:pStyle w:val="Titre3"/>
+      </w:pPr>
+      <w:r>
+        <w:lastRenderedPageBreak/>
+        <w:t>server/config/cloudinary.js</w:t>
+      </w:r>
+    </w:p>
+    <w:p>
+      <w:r>
+        <w:rPr>
+          <w:noProof/>
+        </w:rPr>
+        <w:drawing>
+          <wp:inline distT="0" distB="0" distL="0" distR="0" wp14:anchorId="07A69986" wp14:editId="12FC175C">
+            <wp:extent cx="5476875" cy="2647950"/>
+            <wp:effectExtent l="0" t="0" r="9525" b="0"/>
+            <wp:docPr id="1567283998" name="Image 1" descr="Une image contenant texte, capture d’écran, Police&#10;&#10;Le contenu généré par l’IA peut être incorrect."/>
+            <wp:cNvGraphicFramePr>
+              <a:graphicFrameLocks xmlns:a="http://schemas.openxmlformats.org/drawingml/2006/main" noChangeAspect="1"/>
+            </wp:cNvGraphicFramePr>
+            <a:graphic xmlns:a="http://schemas.openxmlformats.org/drawingml/2006/main">
+              <a:graphicData uri="http://schemas.openxmlformats.org/drawingml/2006/picture">
+                <pic:pic xmlns:pic="http://schemas.openxmlformats.org/drawingml/2006/picture">
+                  <pic:nvPicPr>
+                    <pic:cNvPr id="1567283998" name="Image 1" descr="Une image contenant texte, capture d’écran, Police&#10;&#10;Le contenu généré par l’IA peut être incorrect."/>
+                    <pic:cNvPicPr/>
+                  </pic:nvPicPr>
+                  <pic:blipFill>
+                    <a:blip r:embed="rId23"/>
+                    <a:stretch>
+                      <a:fillRect/>
+                    </a:stretch>
+                  </pic:blipFill>
+                  <pic:spPr>
+                    <a:xfrm>
+                      <a:off x="0" y="0"/>
+                      <a:ext cx="5476875" cy="2647950"/>
+                    </a:xfrm>
+                    <a:prstGeom prst="rect">
+                      <a:avLst/>
+                    </a:prstGeom>
+                  </pic:spPr>
+                </pic:pic>
+              </a:graphicData>
+            </a:graphic>
+          </wp:inline>
+        </w:drawing>
+      </w:r>
+    </w:p>
+    <w:p/>
+    <w:p>
+      <w:pPr>
+        <w:pStyle w:val="Titre3"/>
+      </w:pPr>
+      <w:r>
+        <w:t>server/middlewares/multerCloudinary.js</w:t>
+      </w:r>
+    </w:p>
+    <w:p>
+      <w:r>
+        <w:rPr>
+          <w:noProof/>
+        </w:rPr>
+        <w:drawing>
+          <wp:inline distT="0" distB="0" distL="0" distR="0" wp14:anchorId="0CF60DA0" wp14:editId="3CAC4194">
+            <wp:extent cx="5760720" cy="3663950"/>
+            <wp:effectExtent l="0" t="0" r="0" b="0"/>
+            <wp:docPr id="518154974" name="Image 1" descr="Une image contenant texte, capture d’écran, Police, logiciel&#10;&#10;Le contenu généré par l’IA peut être incorrect."/>
+            <wp:cNvGraphicFramePr>
+              <a:graphicFrameLocks xmlns:a="http://schemas.openxmlformats.org/drawingml/2006/main" noChangeAspect="1"/>
+            </wp:cNvGraphicFramePr>
+            <a:graphic xmlns:a="http://schemas.openxmlformats.org/drawingml/2006/main">
+              <a:graphicData uri="http://schemas.openxmlformats.org/drawingml/2006/picture">
+                <pic:pic xmlns:pic="http://schemas.openxmlformats.org/drawingml/2006/picture">
+                  <pic:nvPicPr>
+                    <pic:cNvPr id="518154974" name="Image 1" descr="Une image contenant texte, capture d’écran, Police, logiciel&#10;&#10;Le contenu généré par l’IA peut être incorrect."/>
+                    <pic:cNvPicPr/>
+                  </pic:nvPicPr>
+                  <pic:blipFill>
+                    <a:blip r:embed="rId24"/>
+                    <a:stretch>
+                      <a:fillRect/>
+                    </a:stretch>
+                  </pic:blipFill>
+                  <pic:spPr>
+                    <a:xfrm>
+                      <a:off x="0" y="0"/>
+                      <a:ext cx="5760720" cy="3663950"/>
+                    </a:xfrm>
+                    <a:prstGeom prst="rect">
+                      <a:avLst/>
+                    </a:prstGeom>
+                  </pic:spPr>
+                </pic:pic>
+              </a:graphicData>
+            </a:graphic>
+          </wp:inline>
+        </w:drawing>
+      </w:r>
+    </w:p>
+    <w:p/>
+    <w:p>
+      <w:pPr>
+        <w:pStyle w:val="Titre2"/>
+      </w:pPr>
+      <w:r>
+        <w:lastRenderedPageBreak/>
+        <w:t xml:space="preserve">4) </w:t>
+      </w:r>
+      <w:proofErr w:type="spellStart"/>
+      <w:r>
+        <w:t>Auth</w:t>
+      </w:r>
+      <w:proofErr w:type="spellEnd"/>
+      <w:r>
+        <w:t xml:space="preserve"> &amp; RBAC (sessions ou JWT)</w:t>
+      </w:r>
+    </w:p>
+    <w:p>
+      <w:pPr>
+        <w:pStyle w:val="Titre3"/>
+      </w:pPr>
+      <w:r>
+        <w:t>Middleware d’accès :</w:t>
+      </w:r>
+    </w:p>
+    <w:p>
+      <w:r>
+        <w:rPr>
+          <w:noProof/>
+        </w:rPr>
+        <w:drawing>
+          <wp:inline distT="0" distB="0" distL="0" distR="0" wp14:anchorId="0CC3799D" wp14:editId="7EA238B0">
+            <wp:extent cx="5760720" cy="3980180"/>
+            <wp:effectExtent l="0" t="0" r="0" b="1270"/>
+            <wp:docPr id="1852628206" name="Image 1" descr="Une image contenant texte, capture d’écran, Police&#10;&#10;Le contenu généré par l’IA peut être incorrect."/>
+            <wp:cNvGraphicFramePr>
+              <a:graphicFrameLocks xmlns:a="http://schemas.openxmlformats.org/drawingml/2006/main" noChangeAspect="1"/>
+            </wp:cNvGraphicFramePr>
+            <a:graphic xmlns:a="http://schemas.openxmlformats.org/drawingml/2006/main">
+              <a:graphicData uri="http://schemas.openxmlformats.org/drawingml/2006/picture">
+                <pic:pic xmlns:pic="http://schemas.openxmlformats.org/drawingml/2006/picture">
+                  <pic:nvPicPr>
+                    <pic:cNvPr id="1852628206" name="Image 1" descr="Une image contenant texte, capture d’écran, Police&#10;&#10;Le contenu généré par l’IA peut être incorrect."/>
+                    <pic:cNvPicPr/>
+                  </pic:nvPicPr>
+                  <pic:blipFill>
+                    <a:blip r:embed="rId25"/>
+                    <a:stretch>
+                      <a:fillRect/>
+                    </a:stretch>
+                  </pic:blipFill>
+                  <pic:spPr>
+                    <a:xfrm>
+                      <a:off x="0" y="0"/>
+                      <a:ext cx="5760720" cy="3980180"/>
+                    </a:xfrm>
+                    <a:prstGeom prst="rect">
+                      <a:avLst/>
+                    </a:prstGeom>
+                  </pic:spPr>
+                </pic:pic>
+              </a:graphicData>
+            </a:graphic>
+          </wp:inline>
+        </w:drawing>
+      </w:r>
+    </w:p>
+    <w:p/>
+    <w:p>
+      <w:pPr>
+        <w:pStyle w:val="Titre3"/>
+      </w:pPr>
+      <w:r>
+        <w:t>Usage (routes Admin) :</w:t>
+      </w:r>
+    </w:p>
+    <w:p>
+      <w:r>
+        <w:rPr>
+          <w:noProof/>
+        </w:rPr>
+        <w:drawing>
+          <wp:inline distT="0" distB="0" distL="0" distR="0" wp14:anchorId="1690FAD8" wp14:editId="3D1AE4EE">
+            <wp:extent cx="5760720" cy="489585"/>
+            <wp:effectExtent l="0" t="0" r="0" b="5715"/>
+            <wp:docPr id="707575237" name="Image 1"/>
+            <wp:cNvGraphicFramePr>
+              <a:graphicFrameLocks xmlns:a="http://schemas.openxmlformats.org/drawingml/2006/main" noChangeAspect="1"/>
+            </wp:cNvGraphicFramePr>
+            <a:graphic xmlns:a="http://schemas.openxmlformats.org/drawingml/2006/main">
+              <a:graphicData uri="http://schemas.openxmlformats.org/drawingml/2006/picture">
+                <pic:pic xmlns:pic="http://schemas.openxmlformats.org/drawingml/2006/picture">
+                  <pic:nvPicPr>
+                    <pic:cNvPr id="707575237" name=""/>
+                    <pic:cNvPicPr/>
+                  </pic:nvPicPr>
+                  <pic:blipFill>
+                    <a:blip r:embed="rId26"/>
+                    <a:stretch>
+                      <a:fillRect/>
+                    </a:stretch>
+                  </pic:blipFill>
+                  <pic:spPr>
+                    <a:xfrm>
+                      <a:off x="0" y="0"/>
+                      <a:ext cx="5760720" cy="489585"/>
+                    </a:xfrm>
+                    <a:prstGeom prst="rect">
+                      <a:avLst/>
+                    </a:prstGeom>
+                  </pic:spPr>
+                </pic:pic>
+              </a:graphicData>
+            </a:graphic>
+          </wp:inline>
+        </w:drawing>
+      </w:r>
+    </w:p>
+    <w:p>
+      <w:r>
+        <w:br w:type="page"/>
+      </w:r>
+    </w:p>
+    <w:p/>
+    <w:p>
+      <w:pPr>
+        <w:pStyle w:val="Titre2"/>
+      </w:pPr>
+      <w:r>
+        <w:t>5) Routes (public, admin, api)</w:t>
+      </w:r>
+    </w:p>
+    <w:p>
+      <w:pPr>
+        <w:pStyle w:val="Titre3"/>
+      </w:pPr>
+      <w:r>
+        <w:t>Public (EJS)</w:t>
+      </w:r>
+    </w:p>
+    <w:p>
+      <w:pPr>
+        <w:numPr>
+          <w:ilvl w:val="0"/>
+          <w:numId w:val="41"/>
+        </w:numPr>
+      </w:pPr>
+      <w:r>
+        <w:t>GET / – accueil</w:t>
+      </w:r>
+    </w:p>
+    <w:p>
+      <w:pPr>
+        <w:numPr>
+          <w:ilvl w:val="0"/>
+          <w:numId w:val="41"/>
+        </w:numPr>
+      </w:pPr>
+      <w:r>
+        <w:t>GET /</w:t>
+      </w:r>
+      <w:proofErr w:type="spellStart"/>
+      <w:proofErr w:type="gramStart"/>
+      <w:r>
+        <w:t>carte?</w:t>
+      </w:r>
+      <w:proofErr w:type="gramEnd"/>
+      <w:r>
+        <w:t>moment</w:t>
+      </w:r>
+      <w:proofErr w:type="spellEnd"/>
+      <w:r>
+        <w:t>=</w:t>
+      </w:r>
+      <w:proofErr w:type="spellStart"/>
+      <w:r>
+        <w:t>matin|soir</w:t>
+      </w:r>
+      <w:proofErr w:type="spellEnd"/>
+      <w:r>
+        <w:t xml:space="preserve"> – affiche carte (depuis Mongo)</w:t>
+      </w:r>
+    </w:p>
+    <w:p>
+      <w:pPr>
+        <w:numPr>
+          <w:ilvl w:val="0"/>
+          <w:numId w:val="41"/>
+        </w:numPr>
+      </w:pPr>
+      <w:r>
+        <w:t>GET /</w:t>
+      </w:r>
+      <w:proofErr w:type="spellStart"/>
+      <w:r>
+        <w:t>reservation</w:t>
+      </w:r>
+      <w:proofErr w:type="spellEnd"/>
+      <w:r>
+        <w:t xml:space="preserve"> – </w:t>
+      </w:r>
+      <w:proofErr w:type="spellStart"/>
+      <w:r>
+        <w:t>form</w:t>
+      </w:r>
+      <w:proofErr w:type="spellEnd"/>
+    </w:p>
+    <w:p>
+      <w:pPr>
+        <w:numPr>
+          <w:ilvl w:val="0"/>
+          <w:numId w:val="41"/>
+        </w:numPr>
+      </w:pPr>
+      <w:r>
+        <w:t>POST /</w:t>
+      </w:r>
+      <w:proofErr w:type="spellStart"/>
+      <w:r>
+        <w:t>reservation</w:t>
+      </w:r>
+      <w:proofErr w:type="spellEnd"/>
+      <w:r>
+        <w:t xml:space="preserve"> – crée une réservation + mail de confirmation</w:t>
+      </w:r>
+    </w:p>
+    <w:p>
+      <w:pPr>
+        <w:numPr>
+          <w:ilvl w:val="0"/>
+          <w:numId w:val="41"/>
+        </w:numPr>
+      </w:pPr>
+      <w:r>
+        <w:t>GET /contact + POST /contact – envoi mail + log en DB (optionnel)</w:t>
+      </w:r>
+    </w:p>
+    <w:p>
+      <w:pPr>
+        <w:numPr>
+          <w:ilvl w:val="0"/>
+          <w:numId w:val="41"/>
+        </w:numPr>
+      </w:pPr>
+      <w:r>
+        <w:t>GET /login, POST /login, GET /</w:t>
+      </w:r>
+      <w:proofErr w:type="spellStart"/>
+      <w:r>
+        <w:t>register</w:t>
+      </w:r>
+      <w:proofErr w:type="spellEnd"/>
+      <w:r>
+        <w:t>, POST /</w:t>
+      </w:r>
+      <w:proofErr w:type="spellStart"/>
+      <w:r>
+        <w:t>register</w:t>
+      </w:r>
+      <w:proofErr w:type="spellEnd"/>
+      <w:r>
+        <w:t>, POST /</w:t>
+      </w:r>
+      <w:proofErr w:type="spellStart"/>
+      <w:r>
+        <w:t>logout</w:t>
+      </w:r>
+      <w:proofErr w:type="spellEnd"/>
+    </w:p>
+    <w:p/>
+    <w:p>
+      <w:pPr>
+        <w:pStyle w:val="Titre3"/>
+      </w:pPr>
+      <w:r>
+        <w:t>Admin (EJS)</w:t>
+      </w:r>
+    </w:p>
+    <w:p>
+      <w:pPr>
+        <w:numPr>
+          <w:ilvl w:val="0"/>
+          <w:numId w:val="42"/>
+        </w:numPr>
+      </w:pPr>
+      <w:r>
+        <w:t xml:space="preserve">GET /admin – </w:t>
+      </w:r>
+      <w:proofErr w:type="spellStart"/>
+      <w:r>
+        <w:t>dashboard</w:t>
+      </w:r>
+      <w:proofErr w:type="spellEnd"/>
+      <w:r>
+        <w:t xml:space="preserve"> (</w:t>
+      </w:r>
+      <w:proofErr w:type="gramStart"/>
+      <w:r>
+        <w:t>widgets:</w:t>
+      </w:r>
+      <w:proofErr w:type="gramEnd"/>
+      <w:r>
+        <w:t xml:space="preserve"> réservations du jour, nb clients, items indispo, etc.)</w:t>
+      </w:r>
+    </w:p>
+    <w:p>
+      <w:pPr>
+        <w:numPr>
+          <w:ilvl w:val="0"/>
+          <w:numId w:val="42"/>
+        </w:numPr>
+      </w:pPr>
+      <w:r>
+        <w:t>GET /admin/</w:t>
+      </w:r>
+      <w:proofErr w:type="spellStart"/>
+      <w:r>
+        <w:t>reservations</w:t>
+      </w:r>
+      <w:proofErr w:type="spellEnd"/>
+      <w:r>
+        <w:t xml:space="preserve"> (liste, filtres date/status)</w:t>
+      </w:r>
+    </w:p>
+    <w:p>
+      <w:pPr>
+        <w:numPr>
+          <w:ilvl w:val="0"/>
+          <w:numId w:val="42"/>
+        </w:numPr>
+      </w:pPr>
+      <w:r>
+        <w:t>POST /admin/</w:t>
+      </w:r>
+      <w:proofErr w:type="spellStart"/>
+      <w:r>
+        <w:t>reservations</w:t>
+      </w:r>
+      <w:proofErr w:type="spellEnd"/>
+      <w:proofErr w:type="gramStart"/>
+      <w:r>
+        <w:t>/:</w:t>
+      </w:r>
+      <w:proofErr w:type="gramEnd"/>
+      <w:r>
+        <w:t>id/status (</w:t>
+      </w:r>
+      <w:proofErr w:type="spellStart"/>
+      <w:r>
+        <w:t>confirm</w:t>
+      </w:r>
+      <w:proofErr w:type="spellEnd"/>
+      <w:r>
+        <w:t>/cancel)</w:t>
+      </w:r>
+    </w:p>
+    <w:p>
+      <w:pPr>
+        <w:numPr>
+          <w:ilvl w:val="0"/>
+          <w:numId w:val="42"/>
+        </w:numPr>
+      </w:pPr>
+      <w:r>
+        <w:t>GET /admin/carte (liste items + filtres moment/catégorie)</w:t>
+      </w:r>
+    </w:p>
+    <w:p>
+      <w:pPr>
+        <w:numPr>
+          <w:ilvl w:val="0"/>
+          <w:numId w:val="42"/>
+        </w:numPr>
+      </w:pPr>
+      <w:r>
+        <w:t xml:space="preserve">GET /admin/carte/new + POST /admin/carte (avec </w:t>
+      </w:r>
+      <w:proofErr w:type="spellStart"/>
+      <w:r>
+        <w:t>upload</w:t>
+      </w:r>
+      <w:proofErr w:type="spellEnd"/>
+      <w:r>
+        <w:t xml:space="preserve"> Cloudinary)</w:t>
+      </w:r>
+    </w:p>
+    <w:p>
+      <w:pPr>
+        <w:numPr>
+          <w:ilvl w:val="0"/>
+          <w:numId w:val="42"/>
+        </w:numPr>
+      </w:pPr>
+      <w:r>
+        <w:t>GET /admin/carte</w:t>
+      </w:r>
+      <w:proofErr w:type="gramStart"/>
+      <w:r>
+        <w:t>/:</w:t>
+      </w:r>
+      <w:proofErr w:type="gramEnd"/>
+      <w:r>
+        <w:t>id/edit + POST /admin/carte</w:t>
+      </w:r>
+      <w:proofErr w:type="gramStart"/>
+      <w:r>
+        <w:t>/:</w:t>
+      </w:r>
+      <w:proofErr w:type="gramEnd"/>
+      <w:r>
+        <w:t>id (update + image)</w:t>
+      </w:r>
+    </w:p>
+    <w:p>
+      <w:pPr>
+        <w:numPr>
+          <w:ilvl w:val="0"/>
+          <w:numId w:val="42"/>
+        </w:numPr>
+      </w:pPr>
+      <w:r>
+        <w:t>POST /admin/carte</w:t>
+      </w:r>
+      <w:proofErr w:type="gramStart"/>
+      <w:r>
+        <w:t>/:</w:t>
+      </w:r>
+      <w:proofErr w:type="gramEnd"/>
+      <w:r>
+        <w:t>id/delete</w:t>
+      </w:r>
+    </w:p>
+    <w:p>
+      <w:pPr>
+        <w:numPr>
+          <w:ilvl w:val="0"/>
+          <w:numId w:val="42"/>
+        </w:numPr>
+      </w:pPr>
+      <w:r>
+        <w:t xml:space="preserve">GET /admin/clients (liste </w:t>
+      </w:r>
+      <w:proofErr w:type="spellStart"/>
+      <w:r>
+        <w:t>Customers</w:t>
+      </w:r>
+      <w:proofErr w:type="spellEnd"/>
+      <w:r>
+        <w:t>)</w:t>
+      </w:r>
+    </w:p>
+    <w:p>
+      <w:pPr>
+        <w:numPr>
+          <w:ilvl w:val="0"/>
+          <w:numId w:val="42"/>
+        </w:numPr>
+      </w:pPr>
+      <w:r>
+        <w:t>GET /admin/</w:t>
+      </w:r>
+      <w:proofErr w:type="spellStart"/>
+      <w:r>
+        <w:t>employees</w:t>
+      </w:r>
+      <w:proofErr w:type="spellEnd"/>
+      <w:r>
+        <w:t xml:space="preserve"> (liste </w:t>
+      </w:r>
+      <w:proofErr w:type="spellStart"/>
+      <w:r>
+        <w:t>Employees</w:t>
+      </w:r>
+      <w:proofErr w:type="spellEnd"/>
+      <w:r>
+        <w:t>) + add/edit/delete</w:t>
+      </w:r>
+    </w:p>
+    <w:p/>
+    <w:p>
+      <w:pPr>
+        <w:pStyle w:val="Titre3"/>
+      </w:pPr>
+      <w:r>
+        <w:t xml:space="preserve">API (JSON pour </w:t>
+      </w:r>
+      <w:proofErr w:type="spellStart"/>
+      <w:r>
+        <w:t>fetch</w:t>
+      </w:r>
+      <w:proofErr w:type="spellEnd"/>
+      <w:r>
+        <w:t xml:space="preserve"> côté admin si tu veux du dynamique)</w:t>
+      </w:r>
+    </w:p>
+    <w:p>
+      <w:pPr>
+        <w:numPr>
+          <w:ilvl w:val="0"/>
+          <w:numId w:val="43"/>
+        </w:numPr>
+      </w:pPr>
+      <w:r>
+        <w:t>/api/menu, /api/</w:t>
+      </w:r>
+      <w:proofErr w:type="spellStart"/>
+      <w:r>
+        <w:t>reservations</w:t>
+      </w:r>
+      <w:proofErr w:type="spellEnd"/>
+      <w:r>
+        <w:t>, /api/</w:t>
+      </w:r>
+      <w:proofErr w:type="spellStart"/>
+      <w:r>
+        <w:t>customers</w:t>
+      </w:r>
+      <w:proofErr w:type="spellEnd"/>
+      <w:r>
+        <w:t>, /api/</w:t>
+      </w:r>
+      <w:proofErr w:type="spellStart"/>
+      <w:r>
+        <w:t>employees</w:t>
+      </w:r>
+      <w:proofErr w:type="spellEnd"/>
+      <w:r>
+        <w:t>, /api/</w:t>
+      </w:r>
+      <w:proofErr w:type="spellStart"/>
+      <w:r>
+        <w:t>upload</w:t>
+      </w:r>
+      <w:proofErr w:type="spellEnd"/>
+    </w:p>
+    <w:p/>
+    <w:p/>
+    <w:p>
+      <w:pPr>
+        <w:pStyle w:val="Titre2"/>
+      </w:pPr>
+      <w:r>
+        <w:lastRenderedPageBreak/>
+        <w:t>6) Contrôleurs — exemples brefs</w:t>
+      </w:r>
+    </w:p>
+    <w:p>
+      <w:pPr>
+        <w:pStyle w:val="Titre3"/>
+      </w:pPr>
+      <w:r>
+        <w:t>Carte (admin) — création avec image</w:t>
+      </w:r>
+    </w:p>
+    <w:p>
+      <w:r>
+        <w:rPr>
+          <w:noProof/>
+        </w:rPr>
+        <w:drawing>
+          <wp:inline distT="0" distB="0" distL="0" distR="0" wp14:anchorId="0FA63ED2" wp14:editId="3A5EA50E">
+            <wp:extent cx="5760720" cy="3097530"/>
+            <wp:effectExtent l="0" t="0" r="0" b="7620"/>
+            <wp:docPr id="1587737354" name="Image 1" descr="Une image contenant texte, capture d’écran, logiciel&#10;&#10;Le contenu généré par l’IA peut être incorrect."/>
+            <wp:cNvGraphicFramePr>
+              <a:graphicFrameLocks xmlns:a="http://schemas.openxmlformats.org/drawingml/2006/main" noChangeAspect="1"/>
+            </wp:cNvGraphicFramePr>
+            <a:graphic xmlns:a="http://schemas.openxmlformats.org/drawingml/2006/main">
+              <a:graphicData uri="http://schemas.openxmlformats.org/drawingml/2006/picture">
+                <pic:pic xmlns:pic="http://schemas.openxmlformats.org/drawingml/2006/picture">
+                  <pic:nvPicPr>
+                    <pic:cNvPr id="1587737354" name="Image 1" descr="Une image contenant texte, capture d’écran, logiciel&#10;&#10;Le contenu généré par l’IA peut être incorrect."/>
+                    <pic:cNvPicPr/>
+                  </pic:nvPicPr>
+                  <pic:blipFill>
+                    <a:blip r:embed="rId27"/>
+                    <a:stretch>
+                      <a:fillRect/>
+                    </a:stretch>
+                  </pic:blipFill>
+                  <pic:spPr>
+                    <a:xfrm>
+                      <a:off x="0" y="0"/>
+                      <a:ext cx="5760720" cy="3097530"/>
+                    </a:xfrm>
+                    <a:prstGeom prst="rect">
+                      <a:avLst/>
+                    </a:prstGeom>
+                  </pic:spPr>
+                </pic:pic>
+              </a:graphicData>
+            </a:graphic>
+          </wp:inline>
+        </w:drawing>
+      </w:r>
+    </w:p>
+    <w:p/>
+    <w:p>
+      <w:pPr>
+        <w:pStyle w:val="Titre3"/>
+      </w:pPr>
+      <w:r>
+        <w:lastRenderedPageBreak/>
+        <w:t>Carte (admin) — création avec image</w:t>
+      </w:r>
+    </w:p>
+    <w:p>
+      <w:r>
+        <w:rPr>
+          <w:noProof/>
+        </w:rPr>
+        <w:drawing>
+          <wp:inline distT="0" distB="0" distL="0" distR="0" wp14:anchorId="181EDBB9" wp14:editId="049CE4D5">
+            <wp:extent cx="5760720" cy="7829550"/>
+            <wp:effectExtent l="0" t="0" r="0" b="0"/>
+            <wp:docPr id="200132342" name="Image 1" descr="Une image contenant texte, capture d’écran&#10;&#10;Le contenu généré par l’IA peut être incorrect."/>
+            <wp:cNvGraphicFramePr>
+              <a:graphicFrameLocks xmlns:a="http://schemas.openxmlformats.org/drawingml/2006/main" noChangeAspect="1"/>
+            </wp:cNvGraphicFramePr>
+            <a:graphic xmlns:a="http://schemas.openxmlformats.org/drawingml/2006/main">
+              <a:graphicData uri="http://schemas.openxmlformats.org/drawingml/2006/picture">
+                <pic:pic xmlns:pic="http://schemas.openxmlformats.org/drawingml/2006/picture">
+                  <pic:nvPicPr>
+                    <pic:cNvPr id="200132342" name="Image 1" descr="Une image contenant texte, capture d’écran&#10;&#10;Le contenu généré par l’IA peut être incorrect."/>
+                    <pic:cNvPicPr/>
+                  </pic:nvPicPr>
+                  <pic:blipFill>
+                    <a:blip r:embed="rId28"/>
+                    <a:stretch>
+                      <a:fillRect/>
+                    </a:stretch>
+                  </pic:blipFill>
+                  <pic:spPr>
+                    <a:xfrm>
+                      <a:off x="0" y="0"/>
+                      <a:ext cx="5760720" cy="7829550"/>
+                    </a:xfrm>
+                    <a:prstGeom prst="rect">
+                      <a:avLst/>
+                    </a:prstGeom>
+                  </pic:spPr>
+                </pic:pic>
+              </a:graphicData>
+            </a:graphic>
+          </wp:inline>
+        </w:drawing>
+      </w:r>
+    </w:p>
+    <w:p/>
+    <w:p>
+      <w:pPr>
+        <w:pStyle w:val="Titre2"/>
+      </w:pPr>
+      <w:r>
+        <w:lastRenderedPageBreak/>
+        <w:t>7) Vues clés (EJS)</w:t>
+      </w:r>
+    </w:p>
+    <w:p>
+      <w:pPr>
+        <w:numPr>
+          <w:ilvl w:val="0"/>
+          <w:numId w:val="44"/>
+        </w:numPr>
+      </w:pPr>
+      <w:r>
+        <w:t>views/</w:t>
+      </w:r>
+      <w:proofErr w:type="spellStart"/>
+      <w:r>
+        <w:t>partials</w:t>
+      </w:r>
+      <w:proofErr w:type="spellEnd"/>
+      <w:r>
+        <w:t xml:space="preserve">/layout.ejs : </w:t>
+      </w:r>
+      <w:proofErr w:type="spellStart"/>
+      <w:r>
+        <w:t>layout</w:t>
+      </w:r>
+      <w:proofErr w:type="spellEnd"/>
+      <w:r>
+        <w:t xml:space="preserve"> global + flash + </w:t>
+      </w:r>
+      <w:proofErr w:type="spellStart"/>
+      <w:r>
+        <w:t>nav</w:t>
+      </w:r>
+      <w:proofErr w:type="spellEnd"/>
+      <w:r>
+        <w:t xml:space="preserve"> selon rôle</w:t>
+      </w:r>
+    </w:p>
+    <w:p>
+      <w:pPr>
+        <w:numPr>
+          <w:ilvl w:val="0"/>
+          <w:numId w:val="44"/>
+        </w:numPr>
+      </w:pPr>
+      <w:r>
+        <w:t>views/admin/</w:t>
+      </w:r>
+      <w:proofErr w:type="spellStart"/>
+      <w:r>
+        <w:t>dashboard.ejs</w:t>
+      </w:r>
+      <w:proofErr w:type="spellEnd"/>
+      <w:r>
+        <w:t xml:space="preserve"> : 4 widgets (réservations du jour, revenus “estimés”, items indispo, clients créés ce mois)</w:t>
+      </w:r>
+    </w:p>
+    <w:p>
+      <w:pPr>
+        <w:numPr>
+          <w:ilvl w:val="0"/>
+          <w:numId w:val="44"/>
+        </w:numPr>
+      </w:pPr>
+      <w:r>
+        <w:t>views/admin/carte/index.ejs : table filtrable + boutons “Éditer/Supprimer”</w:t>
+      </w:r>
+    </w:p>
+    <w:p>
+      <w:pPr>
+        <w:numPr>
+          <w:ilvl w:val="0"/>
+          <w:numId w:val="44"/>
+        </w:numPr>
+      </w:pPr>
+      <w:r>
+        <w:t>views/admin/carte/</w:t>
+      </w:r>
+      <w:proofErr w:type="spellStart"/>
+      <w:r>
+        <w:t>new.ejs</w:t>
+      </w:r>
+      <w:proofErr w:type="spellEnd"/>
+      <w:r>
+        <w:t xml:space="preserve"> : </w:t>
+      </w:r>
+      <w:proofErr w:type="spellStart"/>
+      <w:r>
+        <w:t>form</w:t>
+      </w:r>
+      <w:proofErr w:type="spellEnd"/>
+      <w:r>
+        <w:t xml:space="preserve"> (moment, catégorie, nom, </w:t>
+      </w:r>
+      <w:proofErr w:type="spellStart"/>
+      <w:r>
+        <w:t>desc</w:t>
+      </w:r>
+      <w:proofErr w:type="spellEnd"/>
+      <w:r>
+        <w:t>, prix, image)</w:t>
+      </w:r>
+    </w:p>
+    <w:p>
+      <w:pPr>
+        <w:numPr>
+          <w:ilvl w:val="0"/>
+          <w:numId w:val="44"/>
+        </w:numPr>
+      </w:pPr>
+      <w:r>
+        <w:t>views/pages/</w:t>
+      </w:r>
+      <w:proofErr w:type="spellStart"/>
+      <w:r>
+        <w:t>carte.ejs</w:t>
+      </w:r>
+      <w:proofErr w:type="spellEnd"/>
+      <w:r>
+        <w:t xml:space="preserve"> : rendu beau (tes labels FR, </w:t>
+      </w:r>
+      <w:proofErr w:type="spellStart"/>
+      <w:r>
+        <w:t>formatPrice</w:t>
+      </w:r>
+      <w:proofErr w:type="spellEnd"/>
+      <w:r>
+        <w:t>, tri par cat.)</w:t>
+      </w:r>
+    </w:p>
+    <w:p/>
+    <w:p>
+      <w:pPr>
+        <w:pStyle w:val="Titre2"/>
+      </w:pPr>
+      <w:r>
+        <w:t xml:space="preserve">8) </w:t>
+      </w:r>
+      <w:proofErr w:type="spellStart"/>
+      <w:r>
+        <w:t>Seed</w:t>
+      </w:r>
+      <w:proofErr w:type="spellEnd"/>
+      <w:r>
+        <w:t xml:space="preserve"> de départ</w:t>
+      </w:r>
+    </w:p>
+    <w:p>
+      <w:r>
+        <w:rPr>
+          <w:noProof/>
+        </w:rPr>
+        <w:drawing>
+          <wp:inline distT="0" distB="0" distL="0" distR="0" wp14:anchorId="2BBAE603" wp14:editId="12220E5D">
+            <wp:extent cx="5760720" cy="5473700"/>
+            <wp:effectExtent l="0" t="0" r="0" b="0"/>
+            <wp:docPr id="1758561295" name="Image 1" descr="Une image contenant texte, capture d’écran&#10;&#10;Le contenu généré par l’IA peut être incorrect."/>
+            <wp:cNvGraphicFramePr>
+              <a:graphicFrameLocks xmlns:a="http://schemas.openxmlformats.org/drawingml/2006/main" noChangeAspect="1"/>
+            </wp:cNvGraphicFramePr>
+            <a:graphic xmlns:a="http://schemas.openxmlformats.org/drawingml/2006/main">
+              <a:graphicData uri="http://schemas.openxmlformats.org/drawingml/2006/picture">
+                <pic:pic xmlns:pic="http://schemas.openxmlformats.org/drawingml/2006/picture">
+                  <pic:nvPicPr>
+                    <pic:cNvPr id="1758561295" name="Image 1" descr="Une image contenant texte, capture d’écran&#10;&#10;Le contenu généré par l’IA peut être incorrect."/>
+                    <pic:cNvPicPr/>
+                  </pic:nvPicPr>
+                  <pic:blipFill>
+                    <a:blip r:embed="rId29"/>
+                    <a:stretch>
+                      <a:fillRect/>
+                    </a:stretch>
+                  </pic:blipFill>
+                  <pic:spPr>
+                    <a:xfrm>
+                      <a:off x="0" y="0"/>
+                      <a:ext cx="5760720" cy="5473700"/>
+                    </a:xfrm>
+                    <a:prstGeom prst="rect">
+                      <a:avLst/>
+                    </a:prstGeom>
+                  </pic:spPr>
+                </pic:pic>
+              </a:graphicData>
+            </a:graphic>
+          </wp:inline>
+        </w:drawing>
+      </w:r>
+    </w:p>
+    <w:p/>
+    <w:p/>
+    <w:p>
+      <w:pPr>
+        <w:pStyle w:val="Titre2"/>
+      </w:pPr>
+      <w:r>
+        <w:lastRenderedPageBreak/>
+        <w:t>9) Sécurité &amp; Qualité</w:t>
+      </w:r>
+    </w:p>
+    <w:p>
+      <w:pPr>
+        <w:numPr>
+          <w:ilvl w:val="0"/>
+          <w:numId w:val="46"/>
+        </w:numPr>
+      </w:pPr>
+      <w:r>
+        <w:t xml:space="preserve">Sessions signées (express-session) + cookies </w:t>
+      </w:r>
+      <w:proofErr w:type="spellStart"/>
+      <w:r>
+        <w:t>HttpOnly</w:t>
+      </w:r>
+      <w:proofErr w:type="spellEnd"/>
+      <w:r>
+        <w:t xml:space="preserve">, </w:t>
+      </w:r>
+      <w:proofErr w:type="spellStart"/>
+      <w:r>
+        <w:t>SameSite</w:t>
+      </w:r>
+      <w:proofErr w:type="spellEnd"/>
+      <w:r>
+        <w:t>=</w:t>
+      </w:r>
+      <w:proofErr w:type="spellStart"/>
+      <w:r>
+        <w:t>Lax</w:t>
+      </w:r>
+      <w:proofErr w:type="spellEnd"/>
+      <w:r>
+        <w:t xml:space="preserve">, </w:t>
+      </w:r>
+      <w:proofErr w:type="spellStart"/>
+      <w:r>
+        <w:t>secure</w:t>
+      </w:r>
+      <w:proofErr w:type="spellEnd"/>
+      <w:r>
+        <w:t xml:space="preserve"> en prod.</w:t>
+      </w:r>
+    </w:p>
+    <w:p>
+      <w:pPr>
+        <w:numPr>
+          <w:ilvl w:val="0"/>
+          <w:numId w:val="46"/>
+        </w:numPr>
+      </w:pPr>
+      <w:r>
+        <w:t>Rate-</w:t>
+      </w:r>
+      <w:proofErr w:type="spellStart"/>
+      <w:r>
+        <w:t>limit</w:t>
+      </w:r>
+      <w:proofErr w:type="spellEnd"/>
+      <w:r>
+        <w:t xml:space="preserve"> sur /login &amp; /contact ; </w:t>
+      </w:r>
+      <w:proofErr w:type="spellStart"/>
+      <w:r>
+        <w:t>helmet</w:t>
+      </w:r>
+      <w:proofErr w:type="spellEnd"/>
+      <w:r>
+        <w:t xml:space="preserve"> pour headers (CSP progressive — retirer </w:t>
+      </w:r>
+      <w:proofErr w:type="spellStart"/>
+      <w:r>
+        <w:t>unsafe-inline</w:t>
+      </w:r>
+      <w:proofErr w:type="spellEnd"/>
+      <w:r>
+        <w:t xml:space="preserve"> quand CSS/JS externes).</w:t>
+      </w:r>
+    </w:p>
+    <w:p>
+      <w:pPr>
+        <w:numPr>
+          <w:ilvl w:val="0"/>
+          <w:numId w:val="46"/>
+        </w:numPr>
+      </w:pPr>
+      <w:r>
+        <w:t>Validation (</w:t>
+      </w:r>
+      <w:proofErr w:type="spellStart"/>
+      <w:r>
+        <w:t>joi</w:t>
+      </w:r>
+      <w:proofErr w:type="spellEnd"/>
+      <w:r>
+        <w:t>/</w:t>
+      </w:r>
+      <w:proofErr w:type="spellStart"/>
+      <w:r>
+        <w:t>zod</w:t>
+      </w:r>
+      <w:proofErr w:type="spellEnd"/>
+      <w:r>
+        <w:t>) pour tous les formulaires (</w:t>
+      </w:r>
+      <w:proofErr w:type="spellStart"/>
+      <w:r>
+        <w:t>reservation</w:t>
+      </w:r>
+      <w:proofErr w:type="spellEnd"/>
+      <w:r>
+        <w:t>, contact, carte).</w:t>
+      </w:r>
+    </w:p>
+    <w:p>
+      <w:pPr>
+        <w:numPr>
+          <w:ilvl w:val="0"/>
+          <w:numId w:val="46"/>
+        </w:numPr>
+      </w:pPr>
+      <w:r>
+        <w:t>Logs (</w:t>
+      </w:r>
+      <w:proofErr w:type="spellStart"/>
+      <w:r>
+        <w:t>morgan</w:t>
+      </w:r>
+      <w:proofErr w:type="spellEnd"/>
+      <w:r>
+        <w:t xml:space="preserve"> + logger custom).</w:t>
+      </w:r>
+    </w:p>
+    <w:p>
+      <w:pPr>
+        <w:numPr>
+          <w:ilvl w:val="0"/>
+          <w:numId w:val="46"/>
+        </w:numPr>
+      </w:pPr>
+      <w:r>
+        <w:t>Rôles stricts sur /admin/**.</w:t>
+      </w:r>
+    </w:p>
+    <w:p/>
+    <w:p>
+      <w:pPr>
+        <w:pStyle w:val="Titre2"/>
+      </w:pPr>
+      <w:r>
+        <w:t>10) Plan d’action (rapide &amp; concret)</w:t>
+      </w:r>
+    </w:p>
+    <w:p>
+      <w:pPr>
+        <w:numPr>
+          <w:ilvl w:val="0"/>
+          <w:numId w:val="45"/>
+        </w:numPr>
+      </w:pPr>
+      <w:r>
+        <w:rPr>
+          <w:b/>
+          <w:bCs/>
+        </w:rPr>
+        <w:t xml:space="preserve">Branche </w:t>
+      </w:r>
+      <w:proofErr w:type="gramStart"/>
+      <w:r>
+        <w:rPr>
+          <w:b/>
+          <w:bCs/>
+        </w:rPr>
+        <w:t>Git</w:t>
+      </w:r>
+      <w:r>
+        <w:t>:</w:t>
+      </w:r>
+      <w:proofErr w:type="gramEnd"/>
+      <w:r>
+        <w:t xml:space="preserve"> git switch -c v2.0-admin</w:t>
+      </w:r>
+    </w:p>
+    <w:p>
+      <w:pPr>
+        <w:numPr>
+          <w:ilvl w:val="0"/>
+          <w:numId w:val="45"/>
+        </w:numPr>
+      </w:pPr>
+      <w:proofErr w:type="gramStart"/>
+      <w:r>
+        <w:rPr>
+          <w:b/>
+          <w:bCs/>
+        </w:rPr>
+        <w:t>.</w:t>
+      </w:r>
+      <w:proofErr w:type="spellStart"/>
+      <w:r>
+        <w:rPr>
+          <w:b/>
+          <w:bCs/>
+        </w:rPr>
+        <w:t>env</w:t>
+      </w:r>
+      <w:proofErr w:type="spellEnd"/>
+      <w:proofErr w:type="gramEnd"/>
+      <w:r>
+        <w:t xml:space="preserve"> à partir </w:t>
+      </w:r>
+      <w:proofErr w:type="gramStart"/>
+      <w:r>
+        <w:t>de .</w:t>
+      </w:r>
+      <w:proofErr w:type="spellStart"/>
+      <w:r>
+        <w:t>env</w:t>
+      </w:r>
+      <w:proofErr w:type="gramEnd"/>
+      <w:r>
+        <w:t>.example</w:t>
+      </w:r>
+      <w:proofErr w:type="spellEnd"/>
+      <w:r>
+        <w:t xml:space="preserve"> (Atlas + Cloudinary + SMTP).</w:t>
+      </w:r>
+    </w:p>
+    <w:p>
+      <w:pPr>
+        <w:numPr>
+          <w:ilvl w:val="0"/>
+          <w:numId w:val="45"/>
+        </w:numPr>
+      </w:pPr>
+      <w:proofErr w:type="gramStart"/>
+      <w:r>
+        <w:rPr>
+          <w:b/>
+          <w:bCs/>
+        </w:rPr>
+        <w:t>Installer</w:t>
+      </w:r>
+      <w:r>
+        <w:t>:</w:t>
+      </w:r>
+      <w:proofErr w:type="gramEnd"/>
+      <w:r>
+        <w:t xml:space="preserve"> npm i express ejs express-ejs-</w:t>
+      </w:r>
+      <w:proofErr w:type="spellStart"/>
+      <w:r>
+        <w:t>layouts</w:t>
+      </w:r>
+      <w:proofErr w:type="spellEnd"/>
+      <w:r>
+        <w:t xml:space="preserve"> </w:t>
+      </w:r>
+      <w:proofErr w:type="spellStart"/>
+      <w:r>
+        <w:t>mongoose</w:t>
+      </w:r>
+      <w:proofErr w:type="spellEnd"/>
+      <w:r>
+        <w:t xml:space="preserve"> </w:t>
+      </w:r>
+      <w:proofErr w:type="spellStart"/>
+      <w:r>
+        <w:t>dotenv</w:t>
+      </w:r>
+      <w:proofErr w:type="spellEnd"/>
+      <w:r>
+        <w:t xml:space="preserve"> express-session </w:t>
+      </w:r>
+      <w:proofErr w:type="spellStart"/>
+      <w:r>
+        <w:t>bcrypt</w:t>
+      </w:r>
+      <w:proofErr w:type="spellEnd"/>
+      <w:r>
+        <w:t xml:space="preserve"> </w:t>
+      </w:r>
+      <w:proofErr w:type="spellStart"/>
+      <w:r>
+        <w:t>connect</w:t>
+      </w:r>
+      <w:proofErr w:type="spellEnd"/>
+      <w:r>
+        <w:t xml:space="preserve">-mongo </w:t>
+      </w:r>
+      <w:proofErr w:type="spellStart"/>
+      <w:r>
+        <w:t>multer</w:t>
+      </w:r>
+      <w:proofErr w:type="spellEnd"/>
+      <w:r>
+        <w:t xml:space="preserve"> </w:t>
+      </w:r>
+      <w:proofErr w:type="spellStart"/>
+      <w:r>
+        <w:t>multer-storage-cloudinary</w:t>
+      </w:r>
+      <w:proofErr w:type="spellEnd"/>
+      <w:r>
+        <w:t xml:space="preserve"> </w:t>
+      </w:r>
+      <w:proofErr w:type="spellStart"/>
+      <w:r>
+        <w:t>cloudinary</w:t>
+      </w:r>
+      <w:proofErr w:type="spellEnd"/>
+      <w:r>
+        <w:t xml:space="preserve"> </w:t>
+      </w:r>
+      <w:proofErr w:type="spellStart"/>
+      <w:r>
+        <w:t>helmet</w:t>
+      </w:r>
+      <w:proofErr w:type="spellEnd"/>
+      <w:r>
+        <w:t xml:space="preserve"> </w:t>
+      </w:r>
+      <w:proofErr w:type="spellStart"/>
+      <w:r>
+        <w:t>morgan</w:t>
+      </w:r>
+      <w:proofErr w:type="spellEnd"/>
+      <w:r>
+        <w:t xml:space="preserve"> express-rate-</w:t>
+      </w:r>
+      <w:proofErr w:type="spellStart"/>
+      <w:r>
+        <w:t>limit</w:t>
+      </w:r>
+      <w:proofErr w:type="spellEnd"/>
+      <w:r>
+        <w:t xml:space="preserve"> </w:t>
+      </w:r>
+      <w:proofErr w:type="spellStart"/>
+      <w:r>
+        <w:t>connect</w:t>
+      </w:r>
+      <w:proofErr w:type="spellEnd"/>
+      <w:r>
+        <w:t xml:space="preserve">-flash </w:t>
+      </w:r>
+      <w:proofErr w:type="spellStart"/>
+      <w:r>
+        <w:t>nodemailer</w:t>
+      </w:r>
+      <w:proofErr w:type="spellEnd"/>
+    </w:p>
+    <w:p>
+      <w:pPr>
+        <w:numPr>
+          <w:ilvl w:val="0"/>
+          <w:numId w:val="45"/>
+        </w:numPr>
+      </w:pPr>
+      <w:r>
+        <w:rPr>
+          <w:b/>
+          <w:bCs/>
+        </w:rPr>
+        <w:t>Brancher DB</w:t>
+      </w:r>
+      <w:r>
+        <w:t xml:space="preserve"> (server/config/db.js) et </w:t>
+      </w:r>
+      <w:r>
+        <w:rPr>
+          <w:b/>
+          <w:bCs/>
+        </w:rPr>
+        <w:t>Cloudinary</w:t>
+      </w:r>
+      <w:r>
+        <w:t>.</w:t>
+      </w:r>
+    </w:p>
+    <w:p>
+      <w:pPr>
+        <w:numPr>
+          <w:ilvl w:val="0"/>
+          <w:numId w:val="45"/>
+        </w:numPr>
+      </w:pPr>
+      <w:proofErr w:type="spellStart"/>
+      <w:r>
+        <w:rPr>
+          <w:b/>
+          <w:bCs/>
+        </w:rPr>
+        <w:t>Models</w:t>
+      </w:r>
+      <w:proofErr w:type="spellEnd"/>
+      <w:r>
+        <w:t xml:space="preserve"> (copie ci-dessus).</w:t>
+      </w:r>
+    </w:p>
+    <w:p>
+      <w:pPr>
+        <w:numPr>
+          <w:ilvl w:val="0"/>
+          <w:numId w:val="45"/>
+        </w:numPr>
+      </w:pPr>
+      <w:proofErr w:type="spellStart"/>
+      <w:r>
+        <w:rPr>
+          <w:b/>
+          <w:bCs/>
+        </w:rPr>
+        <w:t>Auth</w:t>
+      </w:r>
+      <w:proofErr w:type="spellEnd"/>
+      <w:r>
+        <w:rPr>
+          <w:b/>
+          <w:bCs/>
+        </w:rPr>
+        <w:t xml:space="preserve"> basique</w:t>
+      </w:r>
+      <w:r>
+        <w:t xml:space="preserve"> (login/</w:t>
+      </w:r>
+      <w:proofErr w:type="spellStart"/>
+      <w:r>
+        <w:t>register</w:t>
+      </w:r>
+      <w:proofErr w:type="spellEnd"/>
+      <w:r>
+        <w:t xml:space="preserve"> + sessions) + </w:t>
+      </w:r>
+      <w:r>
+        <w:rPr>
+          <w:b/>
+          <w:bCs/>
+        </w:rPr>
+        <w:t>RBAC</w:t>
+      </w:r>
+      <w:r>
+        <w:t>.</w:t>
+      </w:r>
+    </w:p>
+    <w:p>
+      <w:pPr>
+        <w:numPr>
+          <w:ilvl w:val="0"/>
+          <w:numId w:val="45"/>
+        </w:numPr>
+      </w:pPr>
+      <w:r>
+        <w:rPr>
+          <w:b/>
+          <w:bCs/>
+        </w:rPr>
+        <w:t>Routes Admin</w:t>
+      </w:r>
+      <w:r>
+        <w:t xml:space="preserve"> carte + réservations + clients + employés.</w:t>
+      </w:r>
+    </w:p>
+    <w:p>
+      <w:pPr>
+        <w:numPr>
+          <w:ilvl w:val="0"/>
+          <w:numId w:val="45"/>
+        </w:numPr>
+      </w:pPr>
+      <w:proofErr w:type="spellStart"/>
+      <w:r>
+        <w:rPr>
+          <w:b/>
+          <w:bCs/>
+        </w:rPr>
+        <w:t>Seeds</w:t>
+      </w:r>
+      <w:proofErr w:type="spellEnd"/>
+      <w:r>
+        <w:t xml:space="preserve"> (npm run </w:t>
+      </w:r>
+      <w:proofErr w:type="spellStart"/>
+      <w:r>
+        <w:t>seed</w:t>
+      </w:r>
+      <w:proofErr w:type="spellEnd"/>
+      <w:r>
+        <w:t>).</w:t>
+      </w:r>
+    </w:p>
+    <w:p>
+      <w:pPr>
+        <w:numPr>
+          <w:ilvl w:val="0"/>
+          <w:numId w:val="45"/>
+        </w:numPr>
+      </w:pPr>
+      <w:r>
+        <w:rPr>
+          <w:b/>
+          <w:bCs/>
+        </w:rPr>
+        <w:t>Vues Admin</w:t>
+      </w:r>
+      <w:r>
+        <w:t xml:space="preserve"> (</w:t>
+      </w:r>
+      <w:proofErr w:type="spellStart"/>
+      <w:r>
+        <w:t>dashboard</w:t>
+      </w:r>
+      <w:proofErr w:type="spellEnd"/>
+      <w:r>
+        <w:t xml:space="preserve"> + CRUD carte).</w:t>
+      </w:r>
+    </w:p>
+    <w:p>
+      <w:pPr>
+        <w:numPr>
+          <w:ilvl w:val="0"/>
+          <w:numId w:val="45"/>
+        </w:numPr>
+      </w:pPr>
+      <w:proofErr w:type="gramStart"/>
+      <w:r>
+        <w:rPr>
+          <w:b/>
+          <w:bCs/>
+        </w:rPr>
+        <w:t>Migration</w:t>
+      </w:r>
+      <w:r>
+        <w:t>:</w:t>
+      </w:r>
+      <w:proofErr w:type="gramEnd"/>
+      <w:r>
+        <w:t xml:space="preserve"> remplacer l’usage de </w:t>
+      </w:r>
+      <w:proofErr w:type="spellStart"/>
+      <w:proofErr w:type="gramStart"/>
+      <w:r>
+        <w:t>carte.json</w:t>
+      </w:r>
+      <w:proofErr w:type="spellEnd"/>
+      <w:proofErr w:type="gramEnd"/>
+      <w:r>
+        <w:t xml:space="preserve"> par MenuItem (mêmes clés moment/catégorie).</w:t>
+      </w:r>
+    </w:p>
+    <w:p/>
+    <w:p/>
     <w:sectPr>
       <w:pgSz w:w="11906" w:h="16838"/>
       <w:pgMar w:top="1417" w:right="1417" w:bottom="1417" w:left="1417" w:header="708" w:footer="708" w:gutter="0"/>
@@ -10454,7 +12428,7 @@
 <w:numbering xmlns:wpc="http://schemas.microsoft.com/office/word/2010/wordprocessingCanvas" xmlns:cx="http://schemas.microsoft.com/office/drawing/2014/chartex" xmlns:cx1="http://schemas.microsoft.com/office/drawing/2015/9/8/chartex" xmlns:cx2="http://schemas.microsoft.com/office/drawing/2015/10/21/chartex" xmlns:cx3="http://schemas.microsoft.com/office/drawing/2016/5/9/chartex" xmlns:cx4="http://schemas.microsoft.com/office/drawing/2016/5/10/chartex" xmlns:cx5="http://schemas.microsoft.com/office/drawing/2016/5/11/chartex" xmlns:cx6="http://schemas.microsoft.com/office/drawing/2016/5/12/chartex" xmlns:cx7="http://schemas.microsoft.com/office/drawing/2016/5/13/chartex" xmlns:cx8="http://schemas.microsoft.com/office/drawing/2016/5/14/chartex" xmlns:mc="http://schemas.openxmlformats.org/markup-compatibility/2006" xmlns:aink="http://schemas.microsoft.com/office/drawing/2016/ink" xmlns:am3d="http://schemas.microsoft.com/office/drawing/2017/model3d" xmlns:o="urn:schemas-microsoft-com:office:office" xmlns:oel="http://schemas.microsoft.com/office/2019/extlst" xmlns:r="http://schemas.openxmlformats.org/officeDocument/2006/relationships" xmlns:m="http://schemas.openxmlformats.org/officeDocument/2006/math" xmlns:v="urn:schemas-microsoft-com:vml" xmlns:wp14="http://schemas.microsoft.com/office/word/2010/wordprocessingDrawing" xmlns:wp="http://schemas.openxmlformats.org/drawingml/2006/wordprocessingDrawing" xmlns:w10="urn:schemas-microsoft-com:office:word" xmlns:w="http://schemas.openxmlformats.org/wordprocessingml/2006/main" xmlns:w14="http://schemas.microsoft.com/office/word/2010/wordml" xmlns:w15="http://schemas.microsoft.com/office/word/2012/wordml" xmlns:w16cex="http://schemas.microsoft.com/office/word/2018/wordml/cex" xmlns:w16cid="http://schemas.microsoft.com/office/word/2016/wordml/cid" xmlns:w16="http://schemas.microsoft.com/office/word/2018/wordml" xmlns:w16du="http://schemas.microsoft.com/office/word/2023/wordml/word16du" xmlns:w16sdtdh="http://schemas.microsoft.com/office/word/2020/wordml/sdtdatahash" xmlns:w16sdtfl="http://schemas.microsoft.com/office/word/2024/wordml/sdtformatlock" xmlns:w16se="http://schemas.microsoft.com/office/word/2015/wordml/symex" xmlns:wpg="http://schemas.microsoft.com/office/word/2010/wordprocessingGroup" xmlns:wpi="http://schemas.microsoft.com/office/word/2010/wordprocessingInk" xmlns:wne="http://schemas.microsoft.com/office/word/2006/wordml" xmlns:wps="http://schemas.microsoft.com/office/word/2010/wordprocessingShape" mc:Ignorable="w14 w15 w16se w16cid w16 w16cex w16sdtdh w16sdtfl w16du wp14">
   <w:numPicBullet w:numPicBulletId="0">
     <w:pict>
-      <v:rect id="_x0000_i1146" style="width:0;height:0" o:hralign="center" o:bullet="t" o:hrstd="t" o:hr="t" fillcolor="#a0a0a0" stroked="f"/>
+      <v:rect id="_x0000_i1136" style="width:0;height:0" o:hralign="center" o:bullet="t" o:hrstd="t" o:hr="t" fillcolor="#a0a0a0" stroked="f"/>
     </w:pict>
   </w:numPicBullet>
   <w:abstractNum w:abstractNumId="0" w15:restartNumberingAfterBreak="0">
@@ -13330,6 +15304,155 @@
     </w:lvl>
   </w:abstractNum>
   <w:abstractNum w:abstractNumId="20" w15:restartNumberingAfterBreak="0">
+    <w:nsid w:val="2AE673AD"/>
+    <w:multiLevelType w:val="multilevel"/>
+    <w:tmpl w:val="0CA6BCFE"/>
+    <w:lvl w:ilvl="0">
+      <w:start w:val="1"/>
+      <w:numFmt w:val="bullet"/>
+      <w:lvlText w:val=""/>
+      <w:lvlJc w:val="left"/>
+      <w:pPr>
+        <w:tabs>
+          <w:tab w:val="num" w:pos="720"/>
+        </w:tabs>
+        <w:ind w:left="720" w:hanging="360"/>
+      </w:pPr>
+      <w:rPr>
+        <w:rFonts w:ascii="Symbol" w:hAnsi="Symbol" w:hint="default"/>
+        <w:sz w:val="20"/>
+      </w:rPr>
+    </w:lvl>
+    <w:lvl w:ilvl="1" w:tentative="1">
+      <w:start w:val="1"/>
+      <w:numFmt w:val="bullet"/>
+      <w:lvlText w:val="o"/>
+      <w:lvlJc w:val="left"/>
+      <w:pPr>
+        <w:tabs>
+          <w:tab w:val="num" w:pos="1440"/>
+        </w:tabs>
+        <w:ind w:left="1440" w:hanging="360"/>
+      </w:pPr>
+      <w:rPr>
+        <w:rFonts w:ascii="Courier New" w:hAnsi="Courier New" w:hint="default"/>
+        <w:sz w:val="20"/>
+      </w:rPr>
+    </w:lvl>
+    <w:lvl w:ilvl="2" w:tentative="1">
+      <w:start w:val="1"/>
+      <w:numFmt w:val="bullet"/>
+      <w:lvlText w:val=""/>
+      <w:lvlJc w:val="left"/>
+      <w:pPr>
+        <w:tabs>
+          <w:tab w:val="num" w:pos="2160"/>
+        </w:tabs>
+        <w:ind w:left="2160" w:hanging="360"/>
+      </w:pPr>
+      <w:rPr>
+        <w:rFonts w:ascii="Wingdings" w:hAnsi="Wingdings" w:hint="default"/>
+        <w:sz w:val="20"/>
+      </w:rPr>
+    </w:lvl>
+    <w:lvl w:ilvl="3" w:tentative="1">
+      <w:start w:val="1"/>
+      <w:numFmt w:val="bullet"/>
+      <w:lvlText w:val=""/>
+      <w:lvlJc w:val="left"/>
+      <w:pPr>
+        <w:tabs>
+          <w:tab w:val="num" w:pos="2880"/>
+        </w:tabs>
+        <w:ind w:left="2880" w:hanging="360"/>
+      </w:pPr>
+      <w:rPr>
+        <w:rFonts w:ascii="Wingdings" w:hAnsi="Wingdings" w:hint="default"/>
+        <w:sz w:val="20"/>
+      </w:rPr>
+    </w:lvl>
+    <w:lvl w:ilvl="4" w:tentative="1">
+      <w:start w:val="1"/>
+      <w:numFmt w:val="bullet"/>
+      <w:lvlText w:val=""/>
+      <w:lvlJc w:val="left"/>
+      <w:pPr>
+        <w:tabs>
+          <w:tab w:val="num" w:pos="3600"/>
+        </w:tabs>
+        <w:ind w:left="3600" w:hanging="360"/>
+      </w:pPr>
+      <w:rPr>
+        <w:rFonts w:ascii="Wingdings" w:hAnsi="Wingdings" w:hint="default"/>
+        <w:sz w:val="20"/>
+      </w:rPr>
+    </w:lvl>
+    <w:lvl w:ilvl="5" w:tentative="1">
+      <w:start w:val="1"/>
+      <w:numFmt w:val="bullet"/>
+      <w:lvlText w:val=""/>
+      <w:lvlJc w:val="left"/>
+      <w:pPr>
+        <w:tabs>
+          <w:tab w:val="num" w:pos="4320"/>
+        </w:tabs>
+        <w:ind w:left="4320" w:hanging="360"/>
+      </w:pPr>
+      <w:rPr>
+        <w:rFonts w:ascii="Wingdings" w:hAnsi="Wingdings" w:hint="default"/>
+        <w:sz w:val="20"/>
+      </w:rPr>
+    </w:lvl>
+    <w:lvl w:ilvl="6" w:tentative="1">
+      <w:start w:val="1"/>
+      <w:numFmt w:val="bullet"/>
+      <w:lvlText w:val=""/>
+      <w:lvlJc w:val="left"/>
+      <w:pPr>
+        <w:tabs>
+          <w:tab w:val="num" w:pos="5040"/>
+        </w:tabs>
+        <w:ind w:left="5040" w:hanging="360"/>
+      </w:pPr>
+      <w:rPr>
+        <w:rFonts w:ascii="Wingdings" w:hAnsi="Wingdings" w:hint="default"/>
+        <w:sz w:val="20"/>
+      </w:rPr>
+    </w:lvl>
+    <w:lvl w:ilvl="7" w:tentative="1">
+      <w:start w:val="1"/>
+      <w:numFmt w:val="bullet"/>
+      <w:lvlText w:val=""/>
+      <w:lvlJc w:val="left"/>
+      <w:pPr>
+        <w:tabs>
+          <w:tab w:val="num" w:pos="5760"/>
+        </w:tabs>
+        <w:ind w:left="5760" w:hanging="360"/>
+      </w:pPr>
+      <w:rPr>
+        <w:rFonts w:ascii="Wingdings" w:hAnsi="Wingdings" w:hint="default"/>
+        <w:sz w:val="20"/>
+      </w:rPr>
+    </w:lvl>
+    <w:lvl w:ilvl="8" w:tentative="1">
+      <w:start w:val="1"/>
+      <w:numFmt w:val="bullet"/>
+      <w:lvlText w:val=""/>
+      <w:lvlJc w:val="left"/>
+      <w:pPr>
+        <w:tabs>
+          <w:tab w:val="num" w:pos="6480"/>
+        </w:tabs>
+        <w:ind w:left="6480" w:hanging="360"/>
+      </w:pPr>
+      <w:rPr>
+        <w:rFonts w:ascii="Wingdings" w:hAnsi="Wingdings" w:hint="default"/>
+        <w:sz w:val="20"/>
+      </w:rPr>
+    </w:lvl>
+  </w:abstractNum>
+  <w:abstractNum w:abstractNumId="21" w15:restartNumberingAfterBreak="0">
     <w:nsid w:val="2E8A10A6"/>
     <w:multiLevelType w:val="multilevel"/>
     <w:tmpl w:val="78781146"/>
@@ -13478,7 +15601,7 @@
       </w:rPr>
     </w:lvl>
   </w:abstractNum>
-  <w:abstractNum w:abstractNumId="21" w15:restartNumberingAfterBreak="0">
+  <w:abstractNum w:abstractNumId="22" w15:restartNumberingAfterBreak="0">
     <w:nsid w:val="2F701477"/>
     <w:multiLevelType w:val="multilevel"/>
     <w:tmpl w:val="A5368F34"/>
@@ -13627,7 +15750,7 @@
       </w:rPr>
     </w:lvl>
   </w:abstractNum>
-  <w:abstractNum w:abstractNumId="22" w15:restartNumberingAfterBreak="0">
+  <w:abstractNum w:abstractNumId="23" w15:restartNumberingAfterBreak="0">
     <w:nsid w:val="34501B77"/>
     <w:multiLevelType w:val="multilevel"/>
     <w:tmpl w:val="B4DCF5FA"/>
@@ -13776,7 +15899,7 @@
       </w:rPr>
     </w:lvl>
   </w:abstractNum>
-  <w:abstractNum w:abstractNumId="23" w15:restartNumberingAfterBreak="0">
+  <w:abstractNum w:abstractNumId="24" w15:restartNumberingAfterBreak="0">
     <w:nsid w:val="37B31B2C"/>
     <w:multiLevelType w:val="multilevel"/>
     <w:tmpl w:val="3A12295E"/>
@@ -13925,7 +16048,7 @@
       </w:rPr>
     </w:lvl>
   </w:abstractNum>
-  <w:abstractNum w:abstractNumId="24" w15:restartNumberingAfterBreak="0">
+  <w:abstractNum w:abstractNumId="25" w15:restartNumberingAfterBreak="0">
     <w:nsid w:val="3B2C58F4"/>
     <w:multiLevelType w:val="multilevel"/>
     <w:tmpl w:val="93EA1772"/>
@@ -14074,7 +16197,7 @@
       </w:rPr>
     </w:lvl>
   </w:abstractNum>
-  <w:abstractNum w:abstractNumId="25" w15:restartNumberingAfterBreak="0">
+  <w:abstractNum w:abstractNumId="26" w15:restartNumberingAfterBreak="0">
     <w:nsid w:val="3F2405D7"/>
     <w:multiLevelType w:val="multilevel"/>
     <w:tmpl w:val="4C0E34C6"/>
@@ -14223,7 +16346,7 @@
       </w:rPr>
     </w:lvl>
   </w:abstractNum>
-  <w:abstractNum w:abstractNumId="26" w15:restartNumberingAfterBreak="0">
+  <w:abstractNum w:abstractNumId="27" w15:restartNumberingAfterBreak="0">
     <w:nsid w:val="41EE7E9D"/>
     <w:multiLevelType w:val="multilevel"/>
     <w:tmpl w:val="2E641CD4"/>
@@ -14336,7 +16459,7 @@
       </w:pPr>
     </w:lvl>
   </w:abstractNum>
-  <w:abstractNum w:abstractNumId="27" w15:restartNumberingAfterBreak="0">
+  <w:abstractNum w:abstractNumId="28" w15:restartNumberingAfterBreak="0">
     <w:nsid w:val="43027293"/>
     <w:multiLevelType w:val="multilevel"/>
     <w:tmpl w:val="63AE9EE2"/>
@@ -14485,7 +16608,7 @@
       </w:rPr>
     </w:lvl>
   </w:abstractNum>
-  <w:abstractNum w:abstractNumId="28" w15:restartNumberingAfterBreak="0">
+  <w:abstractNum w:abstractNumId="29" w15:restartNumberingAfterBreak="0">
     <w:nsid w:val="43A26425"/>
     <w:multiLevelType w:val="multilevel"/>
     <w:tmpl w:val="38BAACA2"/>
@@ -14634,7 +16757,7 @@
       </w:rPr>
     </w:lvl>
   </w:abstractNum>
-  <w:abstractNum w:abstractNumId="29" w15:restartNumberingAfterBreak="0">
+  <w:abstractNum w:abstractNumId="30" w15:restartNumberingAfterBreak="0">
     <w:nsid w:val="46DF2586"/>
     <w:multiLevelType w:val="multilevel"/>
     <w:tmpl w:val="8F90F170"/>
@@ -14783,7 +16906,7 @@
       </w:rPr>
     </w:lvl>
   </w:abstractNum>
-  <w:abstractNum w:abstractNumId="30" w15:restartNumberingAfterBreak="0">
+  <w:abstractNum w:abstractNumId="31" w15:restartNumberingAfterBreak="0">
     <w:nsid w:val="4A932902"/>
     <w:multiLevelType w:val="multilevel"/>
     <w:tmpl w:val="BD60BA40"/>
@@ -14932,7 +17055,7 @@
       </w:rPr>
     </w:lvl>
   </w:abstractNum>
-  <w:abstractNum w:abstractNumId="31" w15:restartNumberingAfterBreak="0">
+  <w:abstractNum w:abstractNumId="32" w15:restartNumberingAfterBreak="0">
     <w:nsid w:val="4D480F7D"/>
     <w:multiLevelType w:val="multilevel"/>
     <w:tmpl w:val="78781146"/>
@@ -15081,7 +17204,7 @@
       </w:rPr>
     </w:lvl>
   </w:abstractNum>
-  <w:abstractNum w:abstractNumId="32" w15:restartNumberingAfterBreak="0">
+  <w:abstractNum w:abstractNumId="33" w15:restartNumberingAfterBreak="0">
     <w:nsid w:val="4D7C4F84"/>
     <w:multiLevelType w:val="multilevel"/>
     <w:tmpl w:val="7280073A"/>
@@ -15230,7 +17353,7 @@
       </w:rPr>
     </w:lvl>
   </w:abstractNum>
-  <w:abstractNum w:abstractNumId="33" w15:restartNumberingAfterBreak="0">
+  <w:abstractNum w:abstractNumId="34" w15:restartNumberingAfterBreak="0">
     <w:nsid w:val="4F44300F"/>
     <w:multiLevelType w:val="multilevel"/>
     <w:tmpl w:val="E1C018A0"/>
@@ -15379,7 +17502,156 @@
       </w:rPr>
     </w:lvl>
   </w:abstractNum>
-  <w:abstractNum w:abstractNumId="34" w15:restartNumberingAfterBreak="0">
+  <w:abstractNum w:abstractNumId="35" w15:restartNumberingAfterBreak="0">
+    <w:nsid w:val="5B5768BB"/>
+    <w:multiLevelType w:val="multilevel"/>
+    <w:tmpl w:val="11880E20"/>
+    <w:lvl w:ilvl="0">
+      <w:start w:val="1"/>
+      <w:numFmt w:val="bullet"/>
+      <w:lvlText w:val=""/>
+      <w:lvlJc w:val="left"/>
+      <w:pPr>
+        <w:tabs>
+          <w:tab w:val="num" w:pos="720"/>
+        </w:tabs>
+        <w:ind w:left="720" w:hanging="360"/>
+      </w:pPr>
+      <w:rPr>
+        <w:rFonts w:ascii="Symbol" w:hAnsi="Symbol" w:hint="default"/>
+        <w:sz w:val="20"/>
+      </w:rPr>
+    </w:lvl>
+    <w:lvl w:ilvl="1" w:tentative="1">
+      <w:start w:val="1"/>
+      <w:numFmt w:val="bullet"/>
+      <w:lvlText w:val="o"/>
+      <w:lvlJc w:val="left"/>
+      <w:pPr>
+        <w:tabs>
+          <w:tab w:val="num" w:pos="1440"/>
+        </w:tabs>
+        <w:ind w:left="1440" w:hanging="360"/>
+      </w:pPr>
+      <w:rPr>
+        <w:rFonts w:ascii="Courier New" w:hAnsi="Courier New" w:hint="default"/>
+        <w:sz w:val="20"/>
+      </w:rPr>
+    </w:lvl>
+    <w:lvl w:ilvl="2" w:tentative="1">
+      <w:start w:val="1"/>
+      <w:numFmt w:val="bullet"/>
+      <w:lvlText w:val=""/>
+      <w:lvlJc w:val="left"/>
+      <w:pPr>
+        <w:tabs>
+          <w:tab w:val="num" w:pos="2160"/>
+        </w:tabs>
+        <w:ind w:left="2160" w:hanging="360"/>
+      </w:pPr>
+      <w:rPr>
+        <w:rFonts w:ascii="Wingdings" w:hAnsi="Wingdings" w:hint="default"/>
+        <w:sz w:val="20"/>
+      </w:rPr>
+    </w:lvl>
+    <w:lvl w:ilvl="3" w:tentative="1">
+      <w:start w:val="1"/>
+      <w:numFmt w:val="bullet"/>
+      <w:lvlText w:val=""/>
+      <w:lvlJc w:val="left"/>
+      <w:pPr>
+        <w:tabs>
+          <w:tab w:val="num" w:pos="2880"/>
+        </w:tabs>
+        <w:ind w:left="2880" w:hanging="360"/>
+      </w:pPr>
+      <w:rPr>
+        <w:rFonts w:ascii="Wingdings" w:hAnsi="Wingdings" w:hint="default"/>
+        <w:sz w:val="20"/>
+      </w:rPr>
+    </w:lvl>
+    <w:lvl w:ilvl="4" w:tentative="1">
+      <w:start w:val="1"/>
+      <w:numFmt w:val="bullet"/>
+      <w:lvlText w:val=""/>
+      <w:lvlJc w:val="left"/>
+      <w:pPr>
+        <w:tabs>
+          <w:tab w:val="num" w:pos="3600"/>
+        </w:tabs>
+        <w:ind w:left="3600" w:hanging="360"/>
+      </w:pPr>
+      <w:rPr>
+        <w:rFonts w:ascii="Wingdings" w:hAnsi="Wingdings" w:hint="default"/>
+        <w:sz w:val="20"/>
+      </w:rPr>
+    </w:lvl>
+    <w:lvl w:ilvl="5" w:tentative="1">
+      <w:start w:val="1"/>
+      <w:numFmt w:val="bullet"/>
+      <w:lvlText w:val=""/>
+      <w:lvlJc w:val="left"/>
+      <w:pPr>
+        <w:tabs>
+          <w:tab w:val="num" w:pos="4320"/>
+        </w:tabs>
+        <w:ind w:left="4320" w:hanging="360"/>
+      </w:pPr>
+      <w:rPr>
+        <w:rFonts w:ascii="Wingdings" w:hAnsi="Wingdings" w:hint="default"/>
+        <w:sz w:val="20"/>
+      </w:rPr>
+    </w:lvl>
+    <w:lvl w:ilvl="6" w:tentative="1">
+      <w:start w:val="1"/>
+      <w:numFmt w:val="bullet"/>
+      <w:lvlText w:val=""/>
+      <w:lvlJc w:val="left"/>
+      <w:pPr>
+        <w:tabs>
+          <w:tab w:val="num" w:pos="5040"/>
+        </w:tabs>
+        <w:ind w:left="5040" w:hanging="360"/>
+      </w:pPr>
+      <w:rPr>
+        <w:rFonts w:ascii="Wingdings" w:hAnsi="Wingdings" w:hint="default"/>
+        <w:sz w:val="20"/>
+      </w:rPr>
+    </w:lvl>
+    <w:lvl w:ilvl="7" w:tentative="1">
+      <w:start w:val="1"/>
+      <w:numFmt w:val="bullet"/>
+      <w:lvlText w:val=""/>
+      <w:lvlJc w:val="left"/>
+      <w:pPr>
+        <w:tabs>
+          <w:tab w:val="num" w:pos="5760"/>
+        </w:tabs>
+        <w:ind w:left="5760" w:hanging="360"/>
+      </w:pPr>
+      <w:rPr>
+        <w:rFonts w:ascii="Wingdings" w:hAnsi="Wingdings" w:hint="default"/>
+        <w:sz w:val="20"/>
+      </w:rPr>
+    </w:lvl>
+    <w:lvl w:ilvl="8" w:tentative="1">
+      <w:start w:val="1"/>
+      <w:numFmt w:val="bullet"/>
+      <w:lvlText w:val=""/>
+      <w:lvlJc w:val="left"/>
+      <w:pPr>
+        <w:tabs>
+          <w:tab w:val="num" w:pos="6480"/>
+        </w:tabs>
+        <w:ind w:left="6480" w:hanging="360"/>
+      </w:pPr>
+      <w:rPr>
+        <w:rFonts w:ascii="Wingdings" w:hAnsi="Wingdings" w:hint="default"/>
+        <w:sz w:val="20"/>
+      </w:rPr>
+    </w:lvl>
+  </w:abstractNum>
+  <w:abstractNum w:abstractNumId="36" w15:restartNumberingAfterBreak="0">
     <w:nsid w:val="62BE65F0"/>
     <w:multiLevelType w:val="multilevel"/>
     <w:tmpl w:val="CE4A690C"/>
@@ -15528,7 +17800,7 @@
       </w:rPr>
     </w:lvl>
   </w:abstractNum>
-  <w:abstractNum w:abstractNumId="35" w15:restartNumberingAfterBreak="0">
+  <w:abstractNum w:abstractNumId="37" w15:restartNumberingAfterBreak="0">
     <w:nsid w:val="632E1BAA"/>
     <w:multiLevelType w:val="multilevel"/>
     <w:tmpl w:val="DC345A14"/>
@@ -15677,7 +17949,156 @@
       </w:rPr>
     </w:lvl>
   </w:abstractNum>
-  <w:abstractNum w:abstractNumId="36" w15:restartNumberingAfterBreak="0">
+  <w:abstractNum w:abstractNumId="38" w15:restartNumberingAfterBreak="0">
+    <w:nsid w:val="648A4946"/>
+    <w:multiLevelType w:val="multilevel"/>
+    <w:tmpl w:val="ADA66A0C"/>
+    <w:lvl w:ilvl="0">
+      <w:start w:val="1"/>
+      <w:numFmt w:val="bullet"/>
+      <w:lvlText w:val=""/>
+      <w:lvlJc w:val="left"/>
+      <w:pPr>
+        <w:tabs>
+          <w:tab w:val="num" w:pos="720"/>
+        </w:tabs>
+        <w:ind w:left="720" w:hanging="360"/>
+      </w:pPr>
+      <w:rPr>
+        <w:rFonts w:ascii="Symbol" w:hAnsi="Symbol" w:hint="default"/>
+        <w:sz w:val="20"/>
+      </w:rPr>
+    </w:lvl>
+    <w:lvl w:ilvl="1" w:tentative="1">
+      <w:start w:val="1"/>
+      <w:numFmt w:val="bullet"/>
+      <w:lvlText w:val="o"/>
+      <w:lvlJc w:val="left"/>
+      <w:pPr>
+        <w:tabs>
+          <w:tab w:val="num" w:pos="1440"/>
+        </w:tabs>
+        <w:ind w:left="1440" w:hanging="360"/>
+      </w:pPr>
+      <w:rPr>
+        <w:rFonts w:ascii="Courier New" w:hAnsi="Courier New" w:hint="default"/>
+        <w:sz w:val="20"/>
+      </w:rPr>
+    </w:lvl>
+    <w:lvl w:ilvl="2" w:tentative="1">
+      <w:start w:val="1"/>
+      <w:numFmt w:val="bullet"/>
+      <w:lvlText w:val=""/>
+      <w:lvlJc w:val="left"/>
+      <w:pPr>
+        <w:tabs>
+          <w:tab w:val="num" w:pos="2160"/>
+        </w:tabs>
+        <w:ind w:left="2160" w:hanging="360"/>
+      </w:pPr>
+      <w:rPr>
+        <w:rFonts w:ascii="Wingdings" w:hAnsi="Wingdings" w:hint="default"/>
+        <w:sz w:val="20"/>
+      </w:rPr>
+    </w:lvl>
+    <w:lvl w:ilvl="3" w:tentative="1">
+      <w:start w:val="1"/>
+      <w:numFmt w:val="bullet"/>
+      <w:lvlText w:val=""/>
+      <w:lvlJc w:val="left"/>
+      <w:pPr>
+        <w:tabs>
+          <w:tab w:val="num" w:pos="2880"/>
+        </w:tabs>
+        <w:ind w:left="2880" w:hanging="360"/>
+      </w:pPr>
+      <w:rPr>
+        <w:rFonts w:ascii="Wingdings" w:hAnsi="Wingdings" w:hint="default"/>
+        <w:sz w:val="20"/>
+      </w:rPr>
+    </w:lvl>
+    <w:lvl w:ilvl="4" w:tentative="1">
+      <w:start w:val="1"/>
+      <w:numFmt w:val="bullet"/>
+      <w:lvlText w:val=""/>
+      <w:lvlJc w:val="left"/>
+      <w:pPr>
+        <w:tabs>
+          <w:tab w:val="num" w:pos="3600"/>
+        </w:tabs>
+        <w:ind w:left="3600" w:hanging="360"/>
+      </w:pPr>
+      <w:rPr>
+        <w:rFonts w:ascii="Wingdings" w:hAnsi="Wingdings" w:hint="default"/>
+        <w:sz w:val="20"/>
+      </w:rPr>
+    </w:lvl>
+    <w:lvl w:ilvl="5" w:tentative="1">
+      <w:start w:val="1"/>
+      <w:numFmt w:val="bullet"/>
+      <w:lvlText w:val=""/>
+      <w:lvlJc w:val="left"/>
+      <w:pPr>
+        <w:tabs>
+          <w:tab w:val="num" w:pos="4320"/>
+        </w:tabs>
+        <w:ind w:left="4320" w:hanging="360"/>
+      </w:pPr>
+      <w:rPr>
+        <w:rFonts w:ascii="Wingdings" w:hAnsi="Wingdings" w:hint="default"/>
+        <w:sz w:val="20"/>
+      </w:rPr>
+    </w:lvl>
+    <w:lvl w:ilvl="6" w:tentative="1">
+      <w:start w:val="1"/>
+      <w:numFmt w:val="bullet"/>
+      <w:lvlText w:val=""/>
+      <w:lvlJc w:val="left"/>
+      <w:pPr>
+        <w:tabs>
+          <w:tab w:val="num" w:pos="5040"/>
+        </w:tabs>
+        <w:ind w:left="5040" w:hanging="360"/>
+      </w:pPr>
+      <w:rPr>
+        <w:rFonts w:ascii="Wingdings" w:hAnsi="Wingdings" w:hint="default"/>
+        <w:sz w:val="20"/>
+      </w:rPr>
+    </w:lvl>
+    <w:lvl w:ilvl="7" w:tentative="1">
+      <w:start w:val="1"/>
+      <w:numFmt w:val="bullet"/>
+      <w:lvlText w:val=""/>
+      <w:lvlJc w:val="left"/>
+      <w:pPr>
+        <w:tabs>
+          <w:tab w:val="num" w:pos="5760"/>
+        </w:tabs>
+        <w:ind w:left="5760" w:hanging="360"/>
+      </w:pPr>
+      <w:rPr>
+        <w:rFonts w:ascii="Wingdings" w:hAnsi="Wingdings" w:hint="default"/>
+        <w:sz w:val="20"/>
+      </w:rPr>
+    </w:lvl>
+    <w:lvl w:ilvl="8" w:tentative="1">
+      <w:start w:val="1"/>
+      <w:numFmt w:val="bullet"/>
+      <w:lvlText w:val=""/>
+      <w:lvlJc w:val="left"/>
+      <w:pPr>
+        <w:tabs>
+          <w:tab w:val="num" w:pos="6480"/>
+        </w:tabs>
+        <w:ind w:left="6480" w:hanging="360"/>
+      </w:pPr>
+      <w:rPr>
+        <w:rFonts w:ascii="Wingdings" w:hAnsi="Wingdings" w:hint="default"/>
+        <w:sz w:val="20"/>
+      </w:rPr>
+    </w:lvl>
+  </w:abstractNum>
+  <w:abstractNum w:abstractNumId="39" w15:restartNumberingAfterBreak="0">
     <w:nsid w:val="64985FB6"/>
     <w:multiLevelType w:val="multilevel"/>
     <w:tmpl w:val="78781146"/>
@@ -15826,7 +18247,156 @@
       </w:rPr>
     </w:lvl>
   </w:abstractNum>
-  <w:abstractNum w:abstractNumId="37" w15:restartNumberingAfterBreak="0">
+  <w:abstractNum w:abstractNumId="40" w15:restartNumberingAfterBreak="0">
+    <w:nsid w:val="65A65C72"/>
+    <w:multiLevelType w:val="multilevel"/>
+    <w:tmpl w:val="B0EC051E"/>
+    <w:lvl w:ilvl="0">
+      <w:start w:val="1"/>
+      <w:numFmt w:val="bullet"/>
+      <w:lvlText w:val=""/>
+      <w:lvlJc w:val="left"/>
+      <w:pPr>
+        <w:tabs>
+          <w:tab w:val="num" w:pos="720"/>
+        </w:tabs>
+        <w:ind w:left="720" w:hanging="360"/>
+      </w:pPr>
+      <w:rPr>
+        <w:rFonts w:ascii="Symbol" w:hAnsi="Symbol" w:hint="default"/>
+        <w:sz w:val="20"/>
+      </w:rPr>
+    </w:lvl>
+    <w:lvl w:ilvl="1" w:tentative="1">
+      <w:start w:val="1"/>
+      <w:numFmt w:val="bullet"/>
+      <w:lvlText w:val="o"/>
+      <w:lvlJc w:val="left"/>
+      <w:pPr>
+        <w:tabs>
+          <w:tab w:val="num" w:pos="1440"/>
+        </w:tabs>
+        <w:ind w:left="1440" w:hanging="360"/>
+      </w:pPr>
+      <w:rPr>
+        <w:rFonts w:ascii="Courier New" w:hAnsi="Courier New" w:hint="default"/>
+        <w:sz w:val="20"/>
+      </w:rPr>
+    </w:lvl>
+    <w:lvl w:ilvl="2" w:tentative="1">
+      <w:start w:val="1"/>
+      <w:numFmt w:val="bullet"/>
+      <w:lvlText w:val=""/>
+      <w:lvlJc w:val="left"/>
+      <w:pPr>
+        <w:tabs>
+          <w:tab w:val="num" w:pos="2160"/>
+        </w:tabs>
+        <w:ind w:left="2160" w:hanging="360"/>
+      </w:pPr>
+      <w:rPr>
+        <w:rFonts w:ascii="Wingdings" w:hAnsi="Wingdings" w:hint="default"/>
+        <w:sz w:val="20"/>
+      </w:rPr>
+    </w:lvl>
+    <w:lvl w:ilvl="3" w:tentative="1">
+      <w:start w:val="1"/>
+      <w:numFmt w:val="bullet"/>
+      <w:lvlText w:val=""/>
+      <w:lvlJc w:val="left"/>
+      <w:pPr>
+        <w:tabs>
+          <w:tab w:val="num" w:pos="2880"/>
+        </w:tabs>
+        <w:ind w:left="2880" w:hanging="360"/>
+      </w:pPr>
+      <w:rPr>
+        <w:rFonts w:ascii="Wingdings" w:hAnsi="Wingdings" w:hint="default"/>
+        <w:sz w:val="20"/>
+      </w:rPr>
+    </w:lvl>
+    <w:lvl w:ilvl="4" w:tentative="1">
+      <w:start w:val="1"/>
+      <w:numFmt w:val="bullet"/>
+      <w:lvlText w:val=""/>
+      <w:lvlJc w:val="left"/>
+      <w:pPr>
+        <w:tabs>
+          <w:tab w:val="num" w:pos="3600"/>
+        </w:tabs>
+        <w:ind w:left="3600" w:hanging="360"/>
+      </w:pPr>
+      <w:rPr>
+        <w:rFonts w:ascii="Wingdings" w:hAnsi="Wingdings" w:hint="default"/>
+        <w:sz w:val="20"/>
+      </w:rPr>
+    </w:lvl>
+    <w:lvl w:ilvl="5" w:tentative="1">
+      <w:start w:val="1"/>
+      <w:numFmt w:val="bullet"/>
+      <w:lvlText w:val=""/>
+      <w:lvlJc w:val="left"/>
+      <w:pPr>
+        <w:tabs>
+          <w:tab w:val="num" w:pos="4320"/>
+        </w:tabs>
+        <w:ind w:left="4320" w:hanging="360"/>
+      </w:pPr>
+      <w:rPr>
+        <w:rFonts w:ascii="Wingdings" w:hAnsi="Wingdings" w:hint="default"/>
+        <w:sz w:val="20"/>
+      </w:rPr>
+    </w:lvl>
+    <w:lvl w:ilvl="6" w:tentative="1">
+      <w:start w:val="1"/>
+      <w:numFmt w:val="bullet"/>
+      <w:lvlText w:val=""/>
+      <w:lvlJc w:val="left"/>
+      <w:pPr>
+        <w:tabs>
+          <w:tab w:val="num" w:pos="5040"/>
+        </w:tabs>
+        <w:ind w:left="5040" w:hanging="360"/>
+      </w:pPr>
+      <w:rPr>
+        <w:rFonts w:ascii="Wingdings" w:hAnsi="Wingdings" w:hint="default"/>
+        <w:sz w:val="20"/>
+      </w:rPr>
+    </w:lvl>
+    <w:lvl w:ilvl="7" w:tentative="1">
+      <w:start w:val="1"/>
+      <w:numFmt w:val="bullet"/>
+      <w:lvlText w:val=""/>
+      <w:lvlJc w:val="left"/>
+      <w:pPr>
+        <w:tabs>
+          <w:tab w:val="num" w:pos="5760"/>
+        </w:tabs>
+        <w:ind w:left="5760" w:hanging="360"/>
+      </w:pPr>
+      <w:rPr>
+        <w:rFonts w:ascii="Wingdings" w:hAnsi="Wingdings" w:hint="default"/>
+        <w:sz w:val="20"/>
+      </w:rPr>
+    </w:lvl>
+    <w:lvl w:ilvl="8" w:tentative="1">
+      <w:start w:val="1"/>
+      <w:numFmt w:val="bullet"/>
+      <w:lvlText w:val=""/>
+      <w:lvlJc w:val="left"/>
+      <w:pPr>
+        <w:tabs>
+          <w:tab w:val="num" w:pos="6480"/>
+        </w:tabs>
+        <w:ind w:left="6480" w:hanging="360"/>
+      </w:pPr>
+      <w:rPr>
+        <w:rFonts w:ascii="Wingdings" w:hAnsi="Wingdings" w:hint="default"/>
+        <w:sz w:val="20"/>
+      </w:rPr>
+    </w:lvl>
+  </w:abstractNum>
+  <w:abstractNum w:abstractNumId="41" w15:restartNumberingAfterBreak="0">
     <w:nsid w:val="6A5F045F"/>
     <w:multiLevelType w:val="multilevel"/>
     <w:tmpl w:val="2CDC8376"/>
@@ -15970,7 +18540,7 @@
       </w:rPr>
     </w:lvl>
   </w:abstractNum>
-  <w:abstractNum w:abstractNumId="38" w15:restartNumberingAfterBreak="0">
+  <w:abstractNum w:abstractNumId="42" w15:restartNumberingAfterBreak="0">
     <w:nsid w:val="6C6F1E75"/>
     <w:multiLevelType w:val="multilevel"/>
     <w:tmpl w:val="78781146"/>
@@ -16119,7 +18689,269 @@
       </w:rPr>
     </w:lvl>
   </w:abstractNum>
-  <w:abstractNum w:abstractNumId="39" w15:restartNumberingAfterBreak="0">
+  <w:abstractNum w:abstractNumId="43" w15:restartNumberingAfterBreak="0">
+    <w:nsid w:val="73246BA5"/>
+    <w:multiLevelType w:val="multilevel"/>
+    <w:tmpl w:val="D3782C64"/>
+    <w:lvl w:ilvl="0">
+      <w:start w:val="1"/>
+      <w:numFmt w:val="decimal"/>
+      <w:lvlText w:val="%1."/>
+      <w:lvlJc w:val="left"/>
+      <w:pPr>
+        <w:tabs>
+          <w:tab w:val="num" w:pos="720"/>
+        </w:tabs>
+        <w:ind w:left="720" w:hanging="360"/>
+      </w:pPr>
+    </w:lvl>
+    <w:lvl w:ilvl="1" w:tentative="1">
+      <w:start w:val="1"/>
+      <w:numFmt w:val="decimal"/>
+      <w:lvlText w:val="%2."/>
+      <w:lvlJc w:val="left"/>
+      <w:pPr>
+        <w:tabs>
+          <w:tab w:val="num" w:pos="1440"/>
+        </w:tabs>
+        <w:ind w:left="1440" w:hanging="360"/>
+      </w:pPr>
+    </w:lvl>
+    <w:lvl w:ilvl="2" w:tentative="1">
+      <w:start w:val="1"/>
+      <w:numFmt w:val="decimal"/>
+      <w:lvlText w:val="%3."/>
+      <w:lvlJc w:val="left"/>
+      <w:pPr>
+        <w:tabs>
+          <w:tab w:val="num" w:pos="2160"/>
+        </w:tabs>
+        <w:ind w:left="2160" w:hanging="360"/>
+      </w:pPr>
+    </w:lvl>
+    <w:lvl w:ilvl="3" w:tentative="1">
+      <w:start w:val="1"/>
+      <w:numFmt w:val="decimal"/>
+      <w:lvlText w:val="%4."/>
+      <w:lvlJc w:val="left"/>
+      <w:pPr>
+        <w:tabs>
+          <w:tab w:val="num" w:pos="2880"/>
+        </w:tabs>
+        <w:ind w:left="2880" w:hanging="360"/>
+      </w:pPr>
+    </w:lvl>
+    <w:lvl w:ilvl="4" w:tentative="1">
+      <w:start w:val="1"/>
+      <w:numFmt w:val="decimal"/>
+      <w:lvlText w:val="%5."/>
+      <w:lvlJc w:val="left"/>
+      <w:pPr>
+        <w:tabs>
+          <w:tab w:val="num" w:pos="3600"/>
+        </w:tabs>
+        <w:ind w:left="3600" w:hanging="360"/>
+      </w:pPr>
+    </w:lvl>
+    <w:lvl w:ilvl="5" w:tentative="1">
+      <w:start w:val="1"/>
+      <w:numFmt w:val="decimal"/>
+      <w:lvlText w:val="%6."/>
+      <w:lvlJc w:val="left"/>
+      <w:pPr>
+        <w:tabs>
+          <w:tab w:val="num" w:pos="4320"/>
+        </w:tabs>
+        <w:ind w:left="4320" w:hanging="360"/>
+      </w:pPr>
+    </w:lvl>
+    <w:lvl w:ilvl="6" w:tentative="1">
+      <w:start w:val="1"/>
+      <w:numFmt w:val="decimal"/>
+      <w:lvlText w:val="%7."/>
+      <w:lvlJc w:val="left"/>
+      <w:pPr>
+        <w:tabs>
+          <w:tab w:val="num" w:pos="5040"/>
+        </w:tabs>
+        <w:ind w:left="5040" w:hanging="360"/>
+      </w:pPr>
+    </w:lvl>
+    <w:lvl w:ilvl="7" w:tentative="1">
+      <w:start w:val="1"/>
+      <w:numFmt w:val="decimal"/>
+      <w:lvlText w:val="%8."/>
+      <w:lvlJc w:val="left"/>
+      <w:pPr>
+        <w:tabs>
+          <w:tab w:val="num" w:pos="5760"/>
+        </w:tabs>
+        <w:ind w:left="5760" w:hanging="360"/>
+      </w:pPr>
+    </w:lvl>
+    <w:lvl w:ilvl="8" w:tentative="1">
+      <w:start w:val="1"/>
+      <w:numFmt w:val="decimal"/>
+      <w:lvlText w:val="%9."/>
+      <w:lvlJc w:val="left"/>
+      <w:pPr>
+        <w:tabs>
+          <w:tab w:val="num" w:pos="6480"/>
+        </w:tabs>
+        <w:ind w:left="6480" w:hanging="360"/>
+      </w:pPr>
+    </w:lvl>
+  </w:abstractNum>
+  <w:abstractNum w:abstractNumId="44" w15:restartNumberingAfterBreak="0">
+    <w:nsid w:val="77170B5E"/>
+    <w:multiLevelType w:val="multilevel"/>
+    <w:tmpl w:val="A68E36EE"/>
+    <w:lvl w:ilvl="0">
+      <w:start w:val="1"/>
+      <w:numFmt w:val="bullet"/>
+      <w:lvlText w:val=""/>
+      <w:lvlJc w:val="left"/>
+      <w:pPr>
+        <w:tabs>
+          <w:tab w:val="num" w:pos="720"/>
+        </w:tabs>
+        <w:ind w:left="720" w:hanging="360"/>
+      </w:pPr>
+      <w:rPr>
+        <w:rFonts w:ascii="Symbol" w:hAnsi="Symbol" w:hint="default"/>
+        <w:sz w:val="20"/>
+      </w:rPr>
+    </w:lvl>
+    <w:lvl w:ilvl="1" w:tentative="1">
+      <w:start w:val="1"/>
+      <w:numFmt w:val="bullet"/>
+      <w:lvlText w:val="o"/>
+      <w:lvlJc w:val="left"/>
+      <w:pPr>
+        <w:tabs>
+          <w:tab w:val="num" w:pos="1440"/>
+        </w:tabs>
+        <w:ind w:left="1440" w:hanging="360"/>
+      </w:pPr>
+      <w:rPr>
+        <w:rFonts w:ascii="Courier New" w:hAnsi="Courier New" w:hint="default"/>
+        <w:sz w:val="20"/>
+      </w:rPr>
+    </w:lvl>
+    <w:lvl w:ilvl="2" w:tentative="1">
+      <w:start w:val="1"/>
+      <w:numFmt w:val="bullet"/>
+      <w:lvlText w:val=""/>
+      <w:lvlJc w:val="left"/>
+      <w:pPr>
+        <w:tabs>
+          <w:tab w:val="num" w:pos="2160"/>
+        </w:tabs>
+        <w:ind w:left="2160" w:hanging="360"/>
+      </w:pPr>
+      <w:rPr>
+        <w:rFonts w:ascii="Wingdings" w:hAnsi="Wingdings" w:hint="default"/>
+        <w:sz w:val="20"/>
+      </w:rPr>
+    </w:lvl>
+    <w:lvl w:ilvl="3" w:tentative="1">
+      <w:start w:val="1"/>
+      <w:numFmt w:val="bullet"/>
+      <w:lvlText w:val=""/>
+      <w:lvlJc w:val="left"/>
+      <w:pPr>
+        <w:tabs>
+          <w:tab w:val="num" w:pos="2880"/>
+        </w:tabs>
+        <w:ind w:left="2880" w:hanging="360"/>
+      </w:pPr>
+      <w:rPr>
+        <w:rFonts w:ascii="Wingdings" w:hAnsi="Wingdings" w:hint="default"/>
+        <w:sz w:val="20"/>
+      </w:rPr>
+    </w:lvl>
+    <w:lvl w:ilvl="4" w:tentative="1">
+      <w:start w:val="1"/>
+      <w:numFmt w:val="bullet"/>
+      <w:lvlText w:val=""/>
+      <w:lvlJc w:val="left"/>
+      <w:pPr>
+        <w:tabs>
+          <w:tab w:val="num" w:pos="3600"/>
+        </w:tabs>
+        <w:ind w:left="3600" w:hanging="360"/>
+      </w:pPr>
+      <w:rPr>
+        <w:rFonts w:ascii="Wingdings" w:hAnsi="Wingdings" w:hint="default"/>
+        <w:sz w:val="20"/>
+      </w:rPr>
+    </w:lvl>
+    <w:lvl w:ilvl="5" w:tentative="1">
+      <w:start w:val="1"/>
+      <w:numFmt w:val="bullet"/>
+      <w:lvlText w:val=""/>
+      <w:lvlJc w:val="left"/>
+      <w:pPr>
+        <w:tabs>
+          <w:tab w:val="num" w:pos="4320"/>
+        </w:tabs>
+        <w:ind w:left="4320" w:hanging="360"/>
+      </w:pPr>
+      <w:rPr>
+        <w:rFonts w:ascii="Wingdings" w:hAnsi="Wingdings" w:hint="default"/>
+        <w:sz w:val="20"/>
+      </w:rPr>
+    </w:lvl>
+    <w:lvl w:ilvl="6" w:tentative="1">
+      <w:start w:val="1"/>
+      <w:numFmt w:val="bullet"/>
+      <w:lvlText w:val=""/>
+      <w:lvlJc w:val="left"/>
+      <w:pPr>
+        <w:tabs>
+          <w:tab w:val="num" w:pos="5040"/>
+        </w:tabs>
+        <w:ind w:left="5040" w:hanging="360"/>
+      </w:pPr>
+      <w:rPr>
+        <w:rFonts w:ascii="Wingdings" w:hAnsi="Wingdings" w:hint="default"/>
+        <w:sz w:val="20"/>
+      </w:rPr>
+    </w:lvl>
+    <w:lvl w:ilvl="7" w:tentative="1">
+      <w:start w:val="1"/>
+      <w:numFmt w:val="bullet"/>
+      <w:lvlText w:val=""/>
+      <w:lvlJc w:val="left"/>
+      <w:pPr>
+        <w:tabs>
+          <w:tab w:val="num" w:pos="5760"/>
+        </w:tabs>
+        <w:ind w:left="5760" w:hanging="360"/>
+      </w:pPr>
+      <w:rPr>
+        <w:rFonts w:ascii="Wingdings" w:hAnsi="Wingdings" w:hint="default"/>
+        <w:sz w:val="20"/>
+      </w:rPr>
+    </w:lvl>
+    <w:lvl w:ilvl="8" w:tentative="1">
+      <w:start w:val="1"/>
+      <w:numFmt w:val="bullet"/>
+      <w:lvlText w:val=""/>
+      <w:lvlJc w:val="left"/>
+      <w:pPr>
+        <w:tabs>
+          <w:tab w:val="num" w:pos="6480"/>
+        </w:tabs>
+        <w:ind w:left="6480" w:hanging="360"/>
+      </w:pPr>
+      <w:rPr>
+        <w:rFonts w:ascii="Wingdings" w:hAnsi="Wingdings" w:hint="default"/>
+        <w:sz w:val="20"/>
+      </w:rPr>
+    </w:lvl>
+  </w:abstractNum>
+  <w:abstractNum w:abstractNumId="45" w15:restartNumberingAfterBreak="0">
     <w:nsid w:val="78BC16A7"/>
     <w:multiLevelType w:val="multilevel"/>
     <w:tmpl w:val="90CA230C"/>
@@ -16269,28 +19101,28 @@
     </w:lvl>
   </w:abstractNum>
   <w:num w:numId="1" w16cid:durableId="2128429962">
-    <w:abstractNumId w:val="33"/>
+    <w:abstractNumId w:val="34"/>
   </w:num>
   <w:num w:numId="2" w16cid:durableId="1423188517">
-    <w:abstractNumId w:val="30"/>
+    <w:abstractNumId w:val="31"/>
   </w:num>
   <w:num w:numId="3" w16cid:durableId="648747896">
     <w:abstractNumId w:val="5"/>
   </w:num>
   <w:num w:numId="4" w16cid:durableId="1783452664">
-    <w:abstractNumId w:val="39"/>
+    <w:abstractNumId w:val="45"/>
   </w:num>
   <w:num w:numId="5" w16cid:durableId="1399791239">
     <w:abstractNumId w:val="3"/>
   </w:num>
   <w:num w:numId="6" w16cid:durableId="138495251">
-    <w:abstractNumId w:val="35"/>
+    <w:abstractNumId w:val="37"/>
   </w:num>
   <w:num w:numId="7" w16cid:durableId="1045135226">
-    <w:abstractNumId w:val="23"/>
+    <w:abstractNumId w:val="24"/>
   </w:num>
   <w:num w:numId="8" w16cid:durableId="723453041">
-    <w:abstractNumId w:val="28"/>
+    <w:abstractNumId w:val="29"/>
   </w:num>
   <w:num w:numId="9" w16cid:durableId="480276391">
     <w:abstractNumId w:val="10"/>
@@ -16308,16 +19140,16 @@
     <w:abstractNumId w:val="4"/>
   </w:num>
   <w:num w:numId="14" w16cid:durableId="1095398358">
-    <w:abstractNumId w:val="34"/>
+    <w:abstractNumId w:val="36"/>
   </w:num>
   <w:num w:numId="15" w16cid:durableId="643045548">
     <w:abstractNumId w:val="9"/>
   </w:num>
   <w:num w:numId="16" w16cid:durableId="2061049455">
-    <w:abstractNumId w:val="27"/>
+    <w:abstractNumId w:val="28"/>
   </w:num>
   <w:num w:numId="17" w16cid:durableId="1923831763">
-    <w:abstractNumId w:val="29"/>
+    <w:abstractNumId w:val="30"/>
   </w:num>
   <w:num w:numId="18" w16cid:durableId="431359181">
     <w:abstractNumId w:val="0"/>
@@ -16326,7 +19158,7 @@
     <w:abstractNumId w:val="7"/>
   </w:num>
   <w:num w:numId="20" w16cid:durableId="1250731">
-    <w:abstractNumId w:val="22"/>
+    <w:abstractNumId w:val="23"/>
   </w:num>
   <w:num w:numId="21" w16cid:durableId="1403721772">
     <w:abstractNumId w:val="14"/>
@@ -16335,22 +19167,22 @@
     <w:abstractNumId w:val="8"/>
   </w:num>
   <w:num w:numId="23" w16cid:durableId="1397434206">
-    <w:abstractNumId w:val="32"/>
+    <w:abstractNumId w:val="33"/>
   </w:num>
   <w:num w:numId="24" w16cid:durableId="1755396119">
     <w:abstractNumId w:val="1"/>
   </w:num>
   <w:num w:numId="25" w16cid:durableId="808791224">
-    <w:abstractNumId w:val="31"/>
+    <w:abstractNumId w:val="32"/>
   </w:num>
   <w:num w:numId="26" w16cid:durableId="820460288">
     <w:abstractNumId w:val="11"/>
   </w:num>
   <w:num w:numId="27" w16cid:durableId="128784930">
-    <w:abstractNumId w:val="25"/>
+    <w:abstractNumId w:val="26"/>
   </w:num>
   <w:num w:numId="28" w16cid:durableId="801776671">
-    <w:abstractNumId w:val="38"/>
+    <w:abstractNumId w:val="42"/>
   </w:num>
   <w:num w:numId="29" w16cid:durableId="1450196900">
     <w:abstractNumId w:val="19"/>
@@ -16365,28 +19197,46 @@
     <w:abstractNumId w:val="17"/>
   </w:num>
   <w:num w:numId="33" w16cid:durableId="631788596">
-    <w:abstractNumId w:val="36"/>
+    <w:abstractNumId w:val="39"/>
   </w:num>
   <w:num w:numId="34" w16cid:durableId="1039545530">
     <w:abstractNumId w:val="12"/>
   </w:num>
   <w:num w:numId="35" w16cid:durableId="1495224696">
-    <w:abstractNumId w:val="20"/>
+    <w:abstractNumId w:val="21"/>
   </w:num>
   <w:num w:numId="36" w16cid:durableId="686059646">
-    <w:abstractNumId w:val="26"/>
+    <w:abstractNumId w:val="27"/>
   </w:num>
   <w:num w:numId="37" w16cid:durableId="319845335">
     <w:abstractNumId w:val="13"/>
   </w:num>
   <w:num w:numId="38" w16cid:durableId="989476915">
-    <w:abstractNumId w:val="37"/>
+    <w:abstractNumId w:val="41"/>
   </w:num>
   <w:num w:numId="39" w16cid:durableId="1569344984">
-    <w:abstractNumId w:val="24"/>
+    <w:abstractNumId w:val="25"/>
   </w:num>
   <w:num w:numId="40" w16cid:durableId="318000909">
-    <w:abstractNumId w:val="21"/>
+    <w:abstractNumId w:val="22"/>
+  </w:num>
+  <w:num w:numId="41" w16cid:durableId="110320371">
+    <w:abstractNumId w:val="20"/>
+  </w:num>
+  <w:num w:numId="42" w16cid:durableId="1910845354">
+    <w:abstractNumId w:val="38"/>
+  </w:num>
+  <w:num w:numId="43" w16cid:durableId="365642771">
+    <w:abstractNumId w:val="35"/>
+  </w:num>
+  <w:num w:numId="44" w16cid:durableId="1296250516">
+    <w:abstractNumId w:val="40"/>
+  </w:num>
+  <w:num w:numId="45" w16cid:durableId="702750410">
+    <w:abstractNumId w:val="43"/>
+  </w:num>
+  <w:num w:numId="46" w16cid:durableId="1230506847">
+    <w:abstractNumId w:val="44"/>
   </w:num>
 </w:numbering>
 </file>
@@ -16992,7 +19842,6 @@
   <w:style w:type="character" w:default="1" w:styleId="Policepardfaut">
     <w:name w:val="Default Paragraph Font"/>
     <w:uiPriority w:val="1"/>
-    <w:semiHidden/>
     <w:unhideWhenUsed/>
   </w:style>
   <w:style w:type="table" w:default="1" w:styleId="TableauNormal">

</xml_diff>